<commit_message>
Add the Qwen evaluation tool and its report; extend the write-up
- arc_qwen/evaluate_generations.py: apply the eval panel to the model's output
  (smell rate, pass@1, similarity, structural profile, cost), reusing measures.py,
  correctness.py, and the detector. HumanEval similarity is scored on the function
  body only to avoid echoed-prompt inflation; HumanEval and MBPP reported separately.
- arc_qwen/evaluation_summary.csv + evaluation_report.html: the results, with the
  report published on the Pages site (new landing-page card).
- docs: "Reading the model's smell distribution" plus the CodeSmellEval comparison,
  explaining why the scale-dependent smells don't appear in short-function generation.
</commit_message>
<xml_diff>
--- a/docs/Code Smells Research Kai v4.docx
+++ b/docs/Code Smells Research Kai v4.docx
@@ -85,7 +85,15 @@
         </w:numPr>
       </w:pPr>
       <w:r>
-        <w:t xml:space="preserve">It should be detectable by the static tools that we are going to use (Radon and Pylint) </w:t>
+        <w:t xml:space="preserve">It should be detectable by the static tools that we are going to use (Radon and </w:t>
+      </w:r>
+      <w:proofErr w:type="spellStart"/>
+      <w:r>
+        <w:t>Pylint</w:t>
+      </w:r>
+      <w:proofErr w:type="spellEnd"/>
+      <w:r>
+        <w:t xml:space="preserve">) </w:t>
       </w:r>
     </w:p>
     <w:p>
@@ -357,7 +365,27 @@
                 <w:sz w:val="18"/>
                 <w:szCs w:val="18"/>
               </w:rPr>
-              <w:t>Yes — high-confidence label in CodeSmellData; Radon SLOC is a direct and precise measure</w:t>
+              <w:t xml:space="preserve">Yes — high-confidence label in </w:t>
+            </w:r>
+            <w:proofErr w:type="spellStart"/>
+            <w:r>
+              <w:rPr>
+                <w:rFonts w:ascii="Arial" w:eastAsia="Arial" w:hAnsi="Arial" w:cs="Arial"/>
+                <w:color w:val="1A1A2E"/>
+                <w:sz w:val="18"/>
+                <w:szCs w:val="18"/>
+              </w:rPr>
+              <w:t>CodeSmellData</w:t>
+            </w:r>
+            <w:proofErr w:type="spellEnd"/>
+            <w:r>
+              <w:rPr>
+                <w:rFonts w:ascii="Arial" w:eastAsia="Arial" w:hAnsi="Arial" w:cs="Arial"/>
+                <w:color w:val="1A1A2E"/>
+                <w:sz w:val="18"/>
+                <w:szCs w:val="18"/>
+              </w:rPr>
+              <w:t>; Radon SLOC is a direct and precise measure</w:t>
             </w:r>
           </w:p>
         </w:tc>
@@ -392,7 +420,27 @@
                 <w:sz w:val="18"/>
                 <w:szCs w:val="18"/>
               </w:rPr>
-              <w:t>Yes — Pylint flags functions with too many arguments (R0913)</w:t>
+              <w:t xml:space="preserve">Yes — </w:t>
+            </w:r>
+            <w:proofErr w:type="spellStart"/>
+            <w:r>
+              <w:rPr>
+                <w:rFonts w:ascii="Arial" w:eastAsia="Arial" w:hAnsi="Arial" w:cs="Arial"/>
+                <w:color w:val="1A1A2E"/>
+                <w:sz w:val="18"/>
+                <w:szCs w:val="18"/>
+              </w:rPr>
+              <w:t>Pylint</w:t>
+            </w:r>
+            <w:proofErr w:type="spellEnd"/>
+            <w:r>
+              <w:rPr>
+                <w:rFonts w:ascii="Arial" w:eastAsia="Arial" w:hAnsi="Arial" w:cs="Arial"/>
+                <w:color w:val="1A1A2E"/>
+                <w:sz w:val="18"/>
+                <w:szCs w:val="18"/>
+              </w:rPr>
+              <w:t xml:space="preserve"> flags functions with too many arguments (R0913)</w:t>
             </w:r>
           </w:p>
         </w:tc>
@@ -424,7 +472,27 @@
                 <w:sz w:val="18"/>
                 <w:szCs w:val="18"/>
               </w:rPr>
-              <w:t>Yes — present in CodeSmellData with good label reliability; a known LLM tendency</w:t>
+              <w:t xml:space="preserve">Yes — present in </w:t>
+            </w:r>
+            <w:proofErr w:type="spellStart"/>
+            <w:r>
+              <w:rPr>
+                <w:rFonts w:ascii="Arial" w:eastAsia="Arial" w:hAnsi="Arial" w:cs="Arial"/>
+                <w:color w:val="1A1A2E"/>
+                <w:sz w:val="18"/>
+                <w:szCs w:val="18"/>
+              </w:rPr>
+              <w:t>CodeSmellData</w:t>
+            </w:r>
+            <w:proofErr w:type="spellEnd"/>
+            <w:r>
+              <w:rPr>
+                <w:rFonts w:ascii="Arial" w:eastAsia="Arial" w:hAnsi="Arial" w:cs="Arial"/>
+                <w:color w:val="1A1A2E"/>
+                <w:sz w:val="18"/>
+                <w:szCs w:val="18"/>
+              </w:rPr>
+              <w:t xml:space="preserve"> with good label reliability; a known LLM tendency</w:t>
             </w:r>
           </w:p>
         </w:tc>
@@ -440,7 +508,27 @@
                 <w:sz w:val="18"/>
                 <w:szCs w:val="18"/>
               </w:rPr>
-              <w:t>Yes — identified as common in Python by Chen et al. and the PyExamine tool study</w:t>
+              <w:t xml:space="preserve">Yes — identified as common in Python by Chen et al. and the </w:t>
+            </w:r>
+            <w:proofErr w:type="spellStart"/>
+            <w:r>
+              <w:rPr>
+                <w:rFonts w:ascii="Arial" w:eastAsia="Arial" w:hAnsi="Arial" w:cs="Arial"/>
+                <w:color w:val="1A1A2E"/>
+                <w:sz w:val="18"/>
+                <w:szCs w:val="18"/>
+              </w:rPr>
+              <w:t>PyExamine</w:t>
+            </w:r>
+            <w:proofErr w:type="spellEnd"/>
+            <w:r>
+              <w:rPr>
+                <w:rFonts w:ascii="Arial" w:eastAsia="Arial" w:hAnsi="Arial" w:cs="Arial"/>
+                <w:color w:val="1A1A2E"/>
+                <w:sz w:val="18"/>
+                <w:szCs w:val="18"/>
+              </w:rPr>
+              <w:t xml:space="preserve"> tool study</w:t>
             </w:r>
           </w:p>
         </w:tc>
@@ -456,7 +544,27 @@
                 <w:sz w:val="18"/>
                 <w:szCs w:val="18"/>
               </w:rPr>
-              <w:t>Yes — Pylint R0913 showed acceptable precision in Velasco et al.’s validation</w:t>
+              <w:t xml:space="preserve">Yes — </w:t>
+            </w:r>
+            <w:proofErr w:type="spellStart"/>
+            <w:r>
+              <w:rPr>
+                <w:rFonts w:ascii="Arial" w:eastAsia="Arial" w:hAnsi="Arial" w:cs="Arial"/>
+                <w:color w:val="1A1A2E"/>
+                <w:sz w:val="18"/>
+                <w:szCs w:val="18"/>
+              </w:rPr>
+              <w:t>Pylint</w:t>
+            </w:r>
+            <w:proofErr w:type="spellEnd"/>
+            <w:r>
+              <w:rPr>
+                <w:rFonts w:ascii="Arial" w:eastAsia="Arial" w:hAnsi="Arial" w:cs="Arial"/>
+                <w:color w:val="1A1A2E"/>
+                <w:sz w:val="18"/>
+                <w:szCs w:val="18"/>
+              </w:rPr>
+              <w:t xml:space="preserve"> R0913 showed acceptable precision in Velasco et al.’s validation</w:t>
             </w:r>
           </w:p>
         </w:tc>
@@ -491,7 +599,27 @@
                 <w:sz w:val="18"/>
                 <w:szCs w:val="18"/>
               </w:rPr>
-              <w:t>Yes — Pylint flags excessive nesting depth (R1702)</w:t>
+              <w:t xml:space="preserve">Yes — </w:t>
+            </w:r>
+            <w:proofErr w:type="spellStart"/>
+            <w:r>
+              <w:rPr>
+                <w:rFonts w:ascii="Arial" w:eastAsia="Arial" w:hAnsi="Arial" w:cs="Arial"/>
+                <w:color w:val="1A1A2E"/>
+                <w:sz w:val="18"/>
+                <w:szCs w:val="18"/>
+              </w:rPr>
+              <w:t>Pylint</w:t>
+            </w:r>
+            <w:proofErr w:type="spellEnd"/>
+            <w:r>
+              <w:rPr>
+                <w:rFonts w:ascii="Arial" w:eastAsia="Arial" w:hAnsi="Arial" w:cs="Arial"/>
+                <w:color w:val="1A1A2E"/>
+                <w:sz w:val="18"/>
+                <w:szCs w:val="18"/>
+              </w:rPr>
+              <w:t xml:space="preserve"> flags excessive nesting depth (R1702)</w:t>
             </w:r>
           </w:p>
         </w:tc>
@@ -539,7 +667,27 @@
                 <w:sz w:val="18"/>
                 <w:szCs w:val="18"/>
               </w:rPr>
-              <w:t>Yes — ranked highly in the PyExamine Python study; a well-documented Python issue</w:t>
+              <w:t xml:space="preserve">Yes — ranked highly in the </w:t>
+            </w:r>
+            <w:proofErr w:type="spellStart"/>
+            <w:r>
+              <w:rPr>
+                <w:rFonts w:ascii="Arial" w:eastAsia="Arial" w:hAnsi="Arial" w:cs="Arial"/>
+                <w:color w:val="1A1A2E"/>
+                <w:sz w:val="18"/>
+                <w:szCs w:val="18"/>
+              </w:rPr>
+              <w:t>PyExamine</w:t>
+            </w:r>
+            <w:proofErr w:type="spellEnd"/>
+            <w:r>
+              <w:rPr>
+                <w:rFonts w:ascii="Arial" w:eastAsia="Arial" w:hAnsi="Arial" w:cs="Arial"/>
+                <w:color w:val="1A1A2E"/>
+                <w:sz w:val="18"/>
+                <w:szCs w:val="18"/>
+              </w:rPr>
+              <w:t xml:space="preserve"> Python study; a well-documented Python issue</w:t>
             </w:r>
           </w:p>
         </w:tc>
@@ -590,7 +738,27 @@
                 <w:sz w:val="18"/>
                 <w:szCs w:val="18"/>
               </w:rPr>
-              <w:t xml:space="preserve">Partial — Pylint can check for repeated blocks across files, but does not reliably detect duplication </w:t>
+              <w:t xml:space="preserve">Partial — </w:t>
+            </w:r>
+            <w:proofErr w:type="spellStart"/>
+            <w:r>
+              <w:rPr>
+                <w:rFonts w:ascii="Arial" w:eastAsia="Arial" w:hAnsi="Arial" w:cs="Arial"/>
+                <w:color w:val="1A1A2E"/>
+                <w:sz w:val="18"/>
+                <w:szCs w:val="18"/>
+              </w:rPr>
+              <w:t>Pylint</w:t>
+            </w:r>
+            <w:proofErr w:type="spellEnd"/>
+            <w:r>
+              <w:rPr>
+                <w:rFonts w:ascii="Arial" w:eastAsia="Arial" w:hAnsi="Arial" w:cs="Arial"/>
+                <w:color w:val="1A1A2E"/>
+                <w:sz w:val="18"/>
+                <w:szCs w:val="18"/>
+              </w:rPr>
+              <w:t xml:space="preserve"> can check for repeated blocks across files, but does not reliably detect duplication </w:t>
             </w:r>
             <w:r>
               <w:rPr>
@@ -743,7 +911,27 @@
                 <w:sz w:val="18"/>
                 <w:szCs w:val="18"/>
               </w:rPr>
-              <w:t>Yes — Velasco et al. found LLMs frequently produce overly complex conditions (e.g. simplifiable-condition)</w:t>
+              <w:t xml:space="preserve">Yes — Velasco et al. found LLMs frequently produce overly complex conditions (e.g. </w:t>
+            </w:r>
+            <w:proofErr w:type="spellStart"/>
+            <w:r>
+              <w:rPr>
+                <w:rFonts w:ascii="Arial" w:eastAsia="Arial" w:hAnsi="Arial" w:cs="Arial"/>
+                <w:color w:val="1A1A2E"/>
+                <w:sz w:val="18"/>
+                <w:szCs w:val="18"/>
+              </w:rPr>
+              <w:t>simplifiable</w:t>
+            </w:r>
+            <w:proofErr w:type="spellEnd"/>
+            <w:r>
+              <w:rPr>
+                <w:rFonts w:ascii="Arial" w:eastAsia="Arial" w:hAnsi="Arial" w:cs="Arial"/>
+                <w:color w:val="1A1A2E"/>
+                <w:sz w:val="18"/>
+                <w:szCs w:val="18"/>
+              </w:rPr>
+              <w:t>-condition)</w:t>
             </w:r>
           </w:p>
         </w:tc>
@@ -759,7 +947,27 @@
                 <w:sz w:val="18"/>
                 <w:szCs w:val="18"/>
               </w:rPr>
-              <w:t>Yes — high cyclomatic complexity is one of the most common structural issues in Python (PyExamine)</w:t>
+              <w:t>Yes — high cyclomatic complexity is one of the most common structural issues in Python (</w:t>
+            </w:r>
+            <w:proofErr w:type="spellStart"/>
+            <w:r>
+              <w:rPr>
+                <w:rFonts w:ascii="Arial" w:eastAsia="Arial" w:hAnsi="Arial" w:cs="Arial"/>
+                <w:color w:val="1A1A2E"/>
+                <w:sz w:val="18"/>
+                <w:szCs w:val="18"/>
+              </w:rPr>
+              <w:t>PyExamine</w:t>
+            </w:r>
+            <w:proofErr w:type="spellEnd"/>
+            <w:r>
+              <w:rPr>
+                <w:rFonts w:ascii="Arial" w:eastAsia="Arial" w:hAnsi="Arial" w:cs="Arial"/>
+                <w:color w:val="1A1A2E"/>
+                <w:sz w:val="18"/>
+                <w:szCs w:val="18"/>
+              </w:rPr>
+              <w:t>)</w:t>
             </w:r>
           </w:p>
         </w:tc>
@@ -810,7 +1018,27 @@
                 <w:sz w:val="18"/>
                 <w:szCs w:val="18"/>
               </w:rPr>
-              <w:t>No — neither Radon nor Pylint flag bare numeric literals by default; a custom check would be needed</w:t>
+              <w:t xml:space="preserve">No — neither Radon nor </w:t>
+            </w:r>
+            <w:proofErr w:type="spellStart"/>
+            <w:r>
+              <w:rPr>
+                <w:rFonts w:ascii="Arial" w:eastAsia="Arial" w:hAnsi="Arial" w:cs="Arial"/>
+                <w:color w:val="1A1A2E"/>
+                <w:sz w:val="18"/>
+                <w:szCs w:val="18"/>
+              </w:rPr>
+              <w:t>Pylint</w:t>
+            </w:r>
+            <w:proofErr w:type="spellEnd"/>
+            <w:r>
+              <w:rPr>
+                <w:rFonts w:ascii="Arial" w:eastAsia="Arial" w:hAnsi="Arial" w:cs="Arial"/>
+                <w:color w:val="1A1A2E"/>
+                <w:sz w:val="18"/>
+                <w:szCs w:val="18"/>
+              </w:rPr>
+              <w:t xml:space="preserve"> flag bare numeric literals by default; a custom check would be needed</w:t>
             </w:r>
           </w:p>
         </w:tc>
@@ -926,7 +1154,27 @@
                 <w:sz w:val="18"/>
                 <w:szCs w:val="18"/>
               </w:rPr>
-              <w:t>No — no Radon or Pylint rule detects this; it requires understanding relationships between classes</w:t>
+              <w:t xml:space="preserve">No — no Radon or </w:t>
+            </w:r>
+            <w:proofErr w:type="spellStart"/>
+            <w:r>
+              <w:rPr>
+                <w:rFonts w:ascii="Arial" w:eastAsia="Arial" w:hAnsi="Arial" w:cs="Arial"/>
+                <w:color w:val="1A1A2E"/>
+                <w:sz w:val="18"/>
+                <w:szCs w:val="18"/>
+              </w:rPr>
+              <w:t>Pylint</w:t>
+            </w:r>
+            <w:proofErr w:type="spellEnd"/>
+            <w:r>
+              <w:rPr>
+                <w:rFonts w:ascii="Arial" w:eastAsia="Arial" w:hAnsi="Arial" w:cs="Arial"/>
+                <w:color w:val="1A1A2E"/>
+                <w:sz w:val="18"/>
+                <w:szCs w:val="18"/>
+              </w:rPr>
+              <w:t xml:space="preserve"> rule detects this; it requires understanding relationships between classes</w:t>
             </w:r>
           </w:p>
         </w:tc>
@@ -1022,8 +1270,19 @@
                 <w:sz w:val="18"/>
                 <w:szCs w:val="18"/>
               </w:rPr>
-              <w:t>No — absent from the reliably labelled portion of CodeSmellData</w:t>
-            </w:r>
+              <w:t xml:space="preserve">No — absent from the reliably labelled portion of </w:t>
+            </w:r>
+            <w:proofErr w:type="spellStart"/>
+            <w:r>
+              <w:rPr>
+                <w:rFonts w:ascii="Arial" w:eastAsia="Arial" w:hAnsi="Arial" w:cs="Arial"/>
+                <w:color w:val="1A1A2E"/>
+                <w:sz w:val="18"/>
+                <w:szCs w:val="18"/>
+              </w:rPr>
+              <w:t>CodeSmellData</w:t>
+            </w:r>
+            <w:proofErr w:type="spellEnd"/>
           </w:p>
         </w:tc>
       </w:tr>
@@ -1222,7 +1481,27 @@
                 <w:sz w:val="18"/>
                 <w:szCs w:val="18"/>
               </w:rPr>
-              <w:t>Yes — Pylint flags this directly</w:t>
+              <w:t xml:space="preserve">Yes — </w:t>
+            </w:r>
+            <w:proofErr w:type="spellStart"/>
+            <w:r>
+              <w:rPr>
+                <w:rFonts w:ascii="Arial" w:eastAsia="Arial" w:hAnsi="Arial" w:cs="Arial"/>
+                <w:color w:val="1A1A2E"/>
+                <w:sz w:val="18"/>
+                <w:szCs w:val="18"/>
+              </w:rPr>
+              <w:t>Pylint</w:t>
+            </w:r>
+            <w:proofErr w:type="spellEnd"/>
+            <w:r>
+              <w:rPr>
+                <w:rFonts w:ascii="Arial" w:eastAsia="Arial" w:hAnsi="Arial" w:cs="Arial"/>
+                <w:color w:val="1A1A2E"/>
+                <w:sz w:val="18"/>
+                <w:szCs w:val="18"/>
+              </w:rPr>
+              <w:t xml:space="preserve"> flags this directly</w:t>
             </w:r>
           </w:p>
         </w:tc>
@@ -1246,7 +1525,27 @@
                 <w:sz w:val="18"/>
                 <w:szCs w:val="18"/>
               </w:rPr>
-              <w:t>Yes — add extra elif branches to an existing conditional</w:t>
+              <w:t xml:space="preserve">Yes — add extra </w:t>
+            </w:r>
+            <w:proofErr w:type="spellStart"/>
+            <w:r>
+              <w:rPr>
+                <w:rFonts w:ascii="Arial" w:eastAsia="Arial" w:hAnsi="Arial" w:cs="Arial"/>
+                <w:color w:val="1A1A2E"/>
+                <w:sz w:val="18"/>
+                <w:szCs w:val="18"/>
+              </w:rPr>
+              <w:t>elif</w:t>
+            </w:r>
+            <w:proofErr w:type="spellEnd"/>
+            <w:r>
+              <w:rPr>
+                <w:rFonts w:ascii="Arial" w:eastAsia="Arial" w:hAnsi="Arial" w:cs="Arial"/>
+                <w:color w:val="1A1A2E"/>
+                <w:sz w:val="18"/>
+                <w:szCs w:val="18"/>
+              </w:rPr>
+              <w:t xml:space="preserve"> branches to an existing conditional</w:t>
             </w:r>
           </w:p>
         </w:tc>
@@ -1318,7 +1617,27 @@
                 <w:sz w:val="18"/>
                 <w:szCs w:val="18"/>
               </w:rPr>
-              <w:t>No — Velasco et al.’s manual review found near-zero label precision for this Pylint rule; the tool fires but the flag is often wrong</w:t>
+              <w:t xml:space="preserve">No — Velasco et al.’s manual review found near-zero label precision for this </w:t>
+            </w:r>
+            <w:proofErr w:type="spellStart"/>
+            <w:r>
+              <w:rPr>
+                <w:rFonts w:ascii="Arial" w:eastAsia="Arial" w:hAnsi="Arial" w:cs="Arial"/>
+                <w:color w:val="1A1A2E"/>
+                <w:sz w:val="18"/>
+                <w:szCs w:val="18"/>
+              </w:rPr>
+              <w:t>Pylint</w:t>
+            </w:r>
+            <w:proofErr w:type="spellEnd"/>
+            <w:r>
+              <w:rPr>
+                <w:rFonts w:ascii="Arial" w:eastAsia="Arial" w:hAnsi="Arial" w:cs="Arial"/>
+                <w:color w:val="1A1A2E"/>
+                <w:sz w:val="18"/>
+                <w:szCs w:val="18"/>
+              </w:rPr>
+              <w:t xml:space="preserve"> rule; the tool fires but the flag is often wrong</w:t>
             </w:r>
           </w:p>
         </w:tc>
@@ -1387,7 +1706,15 @@
         </w:numPr>
       </w:pPr>
       <w:r>
-        <w:t>Duplicate Code (Would require tools beyond the standard Radon and Pylint)</w:t>
+        <w:t xml:space="preserve">Duplicate Code (Would require tools beyond the standard Radon and </w:t>
+      </w:r>
+      <w:proofErr w:type="spellStart"/>
+      <w:r>
+        <w:t>Pylint</w:t>
+      </w:r>
+      <w:proofErr w:type="spellEnd"/>
+      <w:r>
+        <w:t>)</w:t>
       </w:r>
     </w:p>
     <w:p>
@@ -1404,7 +1731,23 @@
           <w:rFonts w:eastAsia="Arial" w:cs="Times New Roman"/>
           <w:color w:val="1A1A2E"/>
         </w:rPr>
-        <w:t>Magic Number is excluded because neither Radon nor Pylint detect it by default, and no reliable label source exists in the datasets used. A custom detector could be written to detect this if we wanted.</w:t>
+        <w:t xml:space="preserve">Magic Number is excluded because neither Radon nor </w:t>
+      </w:r>
+      <w:proofErr w:type="spellStart"/>
+      <w:r>
+        <w:rPr>
+          <w:rFonts w:eastAsia="Arial" w:cs="Times New Roman"/>
+          <w:color w:val="1A1A2E"/>
+        </w:rPr>
+        <w:t>Pylint</w:t>
+      </w:r>
+      <w:proofErr w:type="spellEnd"/>
+      <w:r>
+        <w:rPr>
+          <w:rFonts w:eastAsia="Arial" w:cs="Times New Roman"/>
+          <w:color w:val="1A1A2E"/>
+        </w:rPr>
+        <w:t xml:space="preserve"> detect it by default, and no reliable label source exists in the datasets used. A custom detector could be written to detect this if we wanted.</w:t>
       </w:r>
     </w:p>
     <w:p>
@@ -1455,7 +1798,23 @@
           <w:rFonts w:eastAsia="Arial" w:cs="Times New Roman"/>
           <w:color w:val="1A1A2E"/>
         </w:rPr>
-        <w:t>Too Many Branches (R0912) is excluded despite being detectable and injectable because Velasco et al.’s manual validation found near-zero label precision for this Pylint rule — meaning the tool fires on code that is not actually a problem. Including it would introduce unreliable labels into the benchmark.</w:t>
+        <w:t xml:space="preserve">Too Many Branches (R0912) is excluded despite being detectable and injectable because Velasco et al.’s manual validation found near-zero label precision for this </w:t>
+      </w:r>
+      <w:proofErr w:type="spellStart"/>
+      <w:r>
+        <w:rPr>
+          <w:rFonts w:eastAsia="Arial" w:cs="Times New Roman"/>
+          <w:color w:val="1A1A2E"/>
+        </w:rPr>
+        <w:t>Pylint</w:t>
+      </w:r>
+      <w:proofErr w:type="spellEnd"/>
+      <w:r>
+        <w:rPr>
+          <w:rFonts w:eastAsia="Arial" w:cs="Times New Roman"/>
+          <w:color w:val="1A1A2E"/>
+        </w:rPr>
+        <w:t xml:space="preserve"> rule — meaning the tool fires on code that is not actually a problem. Including it would introduce unreliable labels into the benchmark.</w:t>
       </w:r>
     </w:p>
     <w:p>
@@ -1472,7 +1831,39 @@
           <w:rFonts w:eastAsia="Arial" w:cs="Times New Roman"/>
           <w:color w:val="1A1A2E"/>
         </w:rPr>
-        <w:t xml:space="preserve">Duplicate Code is borderline. It is injectable and observed in LLM output, but Pylint’s detection only compares across files, not within a single function. Since the benchmark evaluates individual functions in isolation, automated detection would be inconsistent. If we want to include it, we must use evaluation tools other than the standard Radon or Pylint. </w:t>
+        <w:t xml:space="preserve">Duplicate Code is borderline. It is injectable and observed in LLM output, but </w:t>
+      </w:r>
+      <w:proofErr w:type="spellStart"/>
+      <w:r>
+        <w:rPr>
+          <w:rFonts w:eastAsia="Arial" w:cs="Times New Roman"/>
+          <w:color w:val="1A1A2E"/>
+        </w:rPr>
+        <w:t>Pylint’s</w:t>
+      </w:r>
+      <w:proofErr w:type="spellEnd"/>
+      <w:r>
+        <w:rPr>
+          <w:rFonts w:eastAsia="Arial" w:cs="Times New Roman"/>
+          <w:color w:val="1A1A2E"/>
+        </w:rPr>
+        <w:t xml:space="preserve"> detection only compares across files, not within a single function. Since the benchmark evaluates individual functions in isolation, automated detection would be inconsistent. If we want to include it, we must use evaluation tools other than the standard Radon or </w:t>
+      </w:r>
+      <w:proofErr w:type="spellStart"/>
+      <w:r>
+        <w:rPr>
+          <w:rFonts w:eastAsia="Arial" w:cs="Times New Roman"/>
+          <w:color w:val="1A1A2E"/>
+        </w:rPr>
+        <w:t>Pylint</w:t>
+      </w:r>
+      <w:proofErr w:type="spellEnd"/>
+      <w:r>
+        <w:rPr>
+          <w:rFonts w:eastAsia="Arial" w:cs="Times New Roman"/>
+          <w:color w:val="1A1A2E"/>
+        </w:rPr>
+        <w:t xml:space="preserve">. </w:t>
       </w:r>
     </w:p>
     <w:p>
@@ -1566,7 +1957,15 @@
       </w:r>
       <w:proofErr w:type="gramEnd"/>
       <w:r>
-        <w:t xml:space="preserve"> Radon and Pylint cannot be run.</w:t>
+        <w:t xml:space="preserve"> Radon and </w:t>
+      </w:r>
+      <w:proofErr w:type="spellStart"/>
+      <w:r>
+        <w:t>Pylint</w:t>
+      </w:r>
+      <w:proofErr w:type="spellEnd"/>
+      <w:r>
+        <w:t xml:space="preserve"> cannot be run.</w:t>
       </w:r>
     </w:p>
     <w:p/>
@@ -1758,6 +2157,7 @@
                 <w:szCs w:val="20"/>
               </w:rPr>
             </w:pPr>
+            <w:proofErr w:type="spellStart"/>
             <w:r>
               <w:rPr>
                 <w:rFonts w:eastAsia="Arial" w:cs="Times New Roman"/>
@@ -1766,7 +2166,18 @@
                 <w:sz w:val="20"/>
                 <w:szCs w:val="20"/>
               </w:rPr>
-              <w:t>CodeSmellData 2.0</w:t>
+              <w:t>CodeSmellData</w:t>
+            </w:r>
+            <w:proofErr w:type="spellEnd"/>
+            <w:r>
+              <w:rPr>
+                <w:rFonts w:eastAsia="Arial" w:cs="Times New Roman"/>
+                <w:b/>
+                <w:bCs/>
+                <w:sz w:val="20"/>
+                <w:szCs w:val="20"/>
+              </w:rPr>
+              <w:t xml:space="preserve"> 2.0</w:t>
             </w:r>
           </w:p>
           <w:p>
@@ -1887,7 +2298,55 @@
                 <w:sz w:val="20"/>
                 <w:szCs w:val="20"/>
               </w:rPr>
-              <w:t>Python, function-level, and it includes the full code of every function — so we can actually run Radon and Pylint on it. The eval_dataset.json file holds 20,500 functions covering 41 smell types, with exactly 500 examples of each, so no single smell dominates. Labels come from Pylint, but the authors hand-checked how accurate the labels were for each smell. It also marks where each smell is and includes some ready-made measurements. It meets every requirement and is the strongest option.</w:t>
+              <w:t xml:space="preserve">Python, function-level, and it includes the full code of every function — so we can actually run Radon and </w:t>
+            </w:r>
+            <w:proofErr w:type="spellStart"/>
+            <w:r>
+              <w:rPr>
+                <w:sz w:val="20"/>
+                <w:szCs w:val="20"/>
+              </w:rPr>
+              <w:t>Pylint</w:t>
+            </w:r>
+            <w:proofErr w:type="spellEnd"/>
+            <w:r>
+              <w:rPr>
+                <w:sz w:val="20"/>
+                <w:szCs w:val="20"/>
+              </w:rPr>
+              <w:t xml:space="preserve"> on it. The </w:t>
+            </w:r>
+            <w:proofErr w:type="spellStart"/>
+            <w:r>
+              <w:rPr>
+                <w:sz w:val="20"/>
+                <w:szCs w:val="20"/>
+              </w:rPr>
+              <w:t>eval_dataset.json</w:t>
+            </w:r>
+            <w:proofErr w:type="spellEnd"/>
+            <w:r>
+              <w:rPr>
+                <w:sz w:val="20"/>
+                <w:szCs w:val="20"/>
+              </w:rPr>
+              <w:t xml:space="preserve"> file holds 20,500 functions covering 41 smell types, with exactly 500 examples of each, so no single smell dominates. Labels come from </w:t>
+            </w:r>
+            <w:proofErr w:type="spellStart"/>
+            <w:r>
+              <w:rPr>
+                <w:sz w:val="20"/>
+                <w:szCs w:val="20"/>
+              </w:rPr>
+              <w:t>Pylint</w:t>
+            </w:r>
+            <w:proofErr w:type="spellEnd"/>
+            <w:r>
+              <w:rPr>
+                <w:sz w:val="20"/>
+                <w:szCs w:val="20"/>
+              </w:rPr>
+              <w:t>, but the authors hand-checked how accurate the labels were for each smell. It also marks where each smell is and includes some ready-made measurements. It meets every requirement and is the strongest option.</w:t>
             </w:r>
           </w:p>
         </w:tc>
@@ -1919,6 +2378,7 @@
                 <w:szCs w:val="20"/>
               </w:rPr>
             </w:pPr>
+            <w:proofErr w:type="spellStart"/>
             <w:r>
               <w:rPr>
                 <w:rFonts w:eastAsia="Arial" w:cs="Times New Roman"/>
@@ -1927,7 +2387,18 @@
                 <w:sz w:val="20"/>
                 <w:szCs w:val="20"/>
               </w:rPr>
-              <w:t>CodeSmellData 1.0</w:t>
+              <w:t>CodeSmellData</w:t>
+            </w:r>
+            <w:proofErr w:type="spellEnd"/>
+            <w:r>
+              <w:rPr>
+                <w:rFonts w:eastAsia="Arial" w:cs="Times New Roman"/>
+                <w:b/>
+                <w:bCs/>
+                <w:sz w:val="20"/>
+                <w:szCs w:val="20"/>
+              </w:rPr>
+              <w:t xml:space="preserve"> 1.0</w:t>
             </w:r>
           </w:p>
           <w:p>
@@ -2079,6 +2550,7 @@
                 <w:szCs w:val="20"/>
               </w:rPr>
             </w:pPr>
+            <w:proofErr w:type="spellStart"/>
             <w:r>
               <w:rPr>
                 <w:b/>
@@ -2088,6 +2560,7 @@
               </w:rPr>
               <w:t>PySmell</w:t>
             </w:r>
+            <w:proofErr w:type="spellEnd"/>
             <w:r>
               <w:rPr>
                 <w:sz w:val="20"/>
@@ -2112,7 +2585,27 @@
                 <w:sz w:val="20"/>
                 <w:szCs w:val="20"/>
               </w:rPr>
-              <w:t>accessed through the NatthidaW companion repo</w:t>
+              <w:t xml:space="preserve">accessed through the </w:t>
+            </w:r>
+            <w:proofErr w:type="spellStart"/>
+            <w:r>
+              <w:rPr>
+                <w:i/>
+                <w:iCs/>
+                <w:sz w:val="20"/>
+                <w:szCs w:val="20"/>
+              </w:rPr>
+              <w:t>NatthidaW</w:t>
+            </w:r>
+            <w:proofErr w:type="spellEnd"/>
+            <w:r>
+              <w:rPr>
+                <w:i/>
+                <w:iCs/>
+                <w:sz w:val="20"/>
+                <w:szCs w:val="20"/>
+              </w:rPr>
+              <w:t xml:space="preserve"> companion repo</w:t>
             </w:r>
           </w:p>
           <w:p>
@@ -2130,8 +2623,18 @@
                   <w:sz w:val="20"/>
                   <w:szCs w:val="20"/>
                 </w:rPr>
-                <w:t>Labels (original): github.com/chenzhifei731/Pysmell</w:t>
+                <w:t>Labels (original): github.com/chenzhifei731/</w:t>
               </w:r>
+              <w:proofErr w:type="spellStart"/>
+              <w:r>
+                <w:rPr>
+                  <w:rStyle w:val="Hyperlink"/>
+                  <w:sz w:val="20"/>
+                  <w:szCs w:val="20"/>
+                </w:rPr>
+                <w:t>Pysmell</w:t>
+              </w:r>
+              <w:proofErr w:type="spellEnd"/>
             </w:hyperlink>
           </w:p>
           <w:p>
@@ -2150,8 +2653,36 @@
                   <w:sz w:val="20"/>
                   <w:szCs w:val="20"/>
                 </w:rPr>
-                <w:t>Code recovery: github.com/NatthidaW/pythoncodesmell</w:t>
+                <w:t>Code recovery: github.com/</w:t>
               </w:r>
+              <w:proofErr w:type="spellStart"/>
+              <w:r>
+                <w:rPr>
+                  <w:rStyle w:val="Hyperlink"/>
+                  <w:sz w:val="20"/>
+                  <w:szCs w:val="20"/>
+                </w:rPr>
+                <w:t>NatthidaW</w:t>
+              </w:r>
+              <w:proofErr w:type="spellEnd"/>
+              <w:r>
+                <w:rPr>
+                  <w:rStyle w:val="Hyperlink"/>
+                  <w:sz w:val="20"/>
+                  <w:szCs w:val="20"/>
+                </w:rPr>
+                <w:t>/</w:t>
+              </w:r>
+              <w:proofErr w:type="spellStart"/>
+              <w:r>
+                <w:rPr>
+                  <w:rStyle w:val="Hyperlink"/>
+                  <w:sz w:val="20"/>
+                  <w:szCs w:val="20"/>
+                </w:rPr>
+                <w:t>pythoncodesmell</w:t>
+              </w:r>
+              <w:proofErr w:type="spellEnd"/>
             </w:hyperlink>
           </w:p>
         </w:tc>
@@ -2235,12 +2766,21 @@
                 <w:szCs w:val="20"/>
               </w:rPr>
             </w:pPr>
-            <w:r>
-              <w:rPr>
-                <w:sz w:val="20"/>
-                <w:szCs w:val="20"/>
-              </w:rPr>
-              <w:t xml:space="preserve">PySmell is the original: real Python projects where each function was labelled smelly or not for ten smells (including Long Method and Long </w:t>
+            <w:proofErr w:type="spellStart"/>
+            <w:r>
+              <w:rPr>
+                <w:sz w:val="20"/>
+                <w:szCs w:val="20"/>
+              </w:rPr>
+              <w:t>PySmell</w:t>
+            </w:r>
+            <w:proofErr w:type="spellEnd"/>
+            <w:r>
+              <w:rPr>
+                <w:sz w:val="20"/>
+                <w:szCs w:val="20"/>
+              </w:rPr>
+              <w:t xml:space="preserve"> is the original: real Python projects where each function was labelled smelly or not for ten smells (including Long Method and Long </w:t>
             </w:r>
             <w:r>
               <w:rPr>
@@ -2280,7 +2820,55 @@
                 <w:sz w:val="20"/>
                 <w:szCs w:val="20"/>
               </w:rPr>
-              <w:t xml:space="preserve">The NatthidaW repo is built on those same labels and adds the missing piece: it records the exact version (Git commit) of every project, so we can download the matching code and run our tools on it. So: PySmell for the trusted, human-checked labels; NatthidaW to get the actual code. </w:t>
+              <w:t xml:space="preserve">The </w:t>
+            </w:r>
+            <w:proofErr w:type="spellStart"/>
+            <w:r>
+              <w:rPr>
+                <w:sz w:val="20"/>
+                <w:szCs w:val="20"/>
+              </w:rPr>
+              <w:t>NatthidaW</w:t>
+            </w:r>
+            <w:proofErr w:type="spellEnd"/>
+            <w:r>
+              <w:rPr>
+                <w:sz w:val="20"/>
+                <w:szCs w:val="20"/>
+              </w:rPr>
+              <w:t xml:space="preserve"> repo is built on those same labels and adds the missing piece: it records the exact version (Git commit) of every project, so we can download the matching code and run our tools on it. So: </w:t>
+            </w:r>
+            <w:proofErr w:type="spellStart"/>
+            <w:r>
+              <w:rPr>
+                <w:sz w:val="20"/>
+                <w:szCs w:val="20"/>
+              </w:rPr>
+              <w:t>PySmell</w:t>
+            </w:r>
+            <w:proofErr w:type="spellEnd"/>
+            <w:r>
+              <w:rPr>
+                <w:sz w:val="20"/>
+                <w:szCs w:val="20"/>
+              </w:rPr>
+              <w:t xml:space="preserve"> for the trusted, human-checked labels; </w:t>
+            </w:r>
+            <w:proofErr w:type="spellStart"/>
+            <w:r>
+              <w:rPr>
+                <w:sz w:val="20"/>
+                <w:szCs w:val="20"/>
+              </w:rPr>
+              <w:t>NatthidaW</w:t>
+            </w:r>
+            <w:proofErr w:type="spellEnd"/>
+            <w:r>
+              <w:rPr>
+                <w:sz w:val="20"/>
+                <w:szCs w:val="20"/>
+              </w:rPr>
+              <w:t xml:space="preserve"> to get the actual code. </w:t>
             </w:r>
           </w:p>
         </w:tc>
@@ -2312,6 +2900,7 @@
                 <w:szCs w:val="20"/>
               </w:rPr>
             </w:pPr>
+            <w:proofErr w:type="spellStart"/>
             <w:r>
               <w:rPr>
                 <w:rFonts w:eastAsia="Arial" w:cs="Times New Roman"/>
@@ -2323,6 +2912,7 @@
               <w:lastRenderedPageBreak/>
               <w:t>SmellyCodeDataset</w:t>
             </w:r>
+            <w:proofErr w:type="spellEnd"/>
           </w:p>
           <w:p>
             <w:pPr>
@@ -2502,7 +3092,27 @@
                 <w:sz w:val="20"/>
                 <w:szCs w:val="20"/>
               </w:rPr>
-              <w:t>(Madeyski &amp; Lewowski, 2020)</w:t>
+              <w:t>(</w:t>
+            </w:r>
+            <w:proofErr w:type="spellStart"/>
+            <w:r>
+              <w:rPr>
+                <w:i/>
+                <w:iCs/>
+                <w:sz w:val="20"/>
+                <w:szCs w:val="20"/>
+              </w:rPr>
+              <w:t>Madeyski</w:t>
+            </w:r>
+            <w:proofErr w:type="spellEnd"/>
+            <w:r>
+              <w:rPr>
+                <w:i/>
+                <w:iCs/>
+                <w:sz w:val="20"/>
+                <w:szCs w:val="20"/>
+              </w:rPr>
+              <w:t xml:space="preserve"> &amp; Lewowski, 2020)</w:t>
             </w:r>
           </w:p>
           <w:p>
@@ -2617,7 +3227,23 @@
                 <w:sz w:val="20"/>
                 <w:szCs w:val="20"/>
               </w:rPr>
-              <w:t xml:space="preserve">Large, industry-relevant, method-level dataset: ~15k snippets manually severity-rated by 26 professional developers, with source code recoverable. Includes Long Method at method level. Rejected: the code is Java/Kotlin, not Python, so it cannot feed a Python Radon/Pylint pipeline. </w:t>
+              <w:t>Large, industry-relevant, method-level dataset: ~15k snippets manually severity-rated by 26 professional developers, with source code recoverable. Includes Long Method at method level. Rejected: the code is Java/Kotlin, not Python, so it cannot feed a Python Radon/</w:t>
+            </w:r>
+            <w:proofErr w:type="spellStart"/>
+            <w:r>
+              <w:rPr>
+                <w:sz w:val="20"/>
+                <w:szCs w:val="20"/>
+              </w:rPr>
+              <w:t>Pylint</w:t>
+            </w:r>
+            <w:proofErr w:type="spellEnd"/>
+            <w:r>
+              <w:rPr>
+                <w:sz w:val="20"/>
+                <w:szCs w:val="20"/>
+              </w:rPr>
+              <w:t xml:space="preserve"> pipeline. </w:t>
             </w:r>
           </w:p>
         </w:tc>
@@ -2641,18 +3267,55 @@
           <w:b/>
           <w:bCs/>
         </w:rPr>
-        <w:t>Use CodeSmellData 2.0 as the main dataset:</w:t>
-      </w:r>
-      <w:r>
-        <w:t xml:space="preserve"> it is Python, function-level, includes the full code, is already balanced at 500 examples per smell, and its labels were hand-checked. It meets every requirement, including the most important one — the code is there to run our tools on. Keep CodeSmellData 1.0 as a backup for any smell that is missing from the 2.0 set.</w:t>
+        <w:t xml:space="preserve">Use </w:t>
+      </w:r>
+      <w:proofErr w:type="spellStart"/>
+      <w:r>
+        <w:rPr>
+          <w:b/>
+          <w:bCs/>
+        </w:rPr>
+        <w:t>CodeSmellData</w:t>
+      </w:r>
+      <w:proofErr w:type="spellEnd"/>
+      <w:r>
+        <w:rPr>
+          <w:b/>
+          <w:bCs/>
+        </w:rPr>
+        <w:t xml:space="preserve"> 2.0 as the main dataset:</w:t>
+      </w:r>
+      <w:r>
+        <w:t xml:space="preserve"> it is Python, function-level, includes the full code, is already balanced at 500 examples per smell, and its labels were hand-checked. It meets every requirement, including the most important one — the code is there to run our tools on. Keep </w:t>
+      </w:r>
+      <w:proofErr w:type="spellStart"/>
+      <w:r>
+        <w:t>CodeSmellData</w:t>
+      </w:r>
+      <w:proofErr w:type="spellEnd"/>
+      <w:r>
+        <w:t xml:space="preserve"> 1.0 as a backup for any smell that is missing from the 2.0 set.</w:t>
       </w:r>
     </w:p>
     <w:p>
       <w:pPr>
         <w:spacing w:after="120"/>
       </w:pPr>
-      <w:r>
-        <w:t>PySmell is used as a secondary source for independently human-labelled Long Method and Long Parameter List examples; its code is recovered via the NatthidaW companion repo, which records each project's exact version.</w:t>
+      <w:proofErr w:type="spellStart"/>
+      <w:r>
+        <w:t>PySmell</w:t>
+      </w:r>
+      <w:proofErr w:type="spellEnd"/>
+      <w:r>
+        <w:t xml:space="preserve"> is used as a secondary source for independently human-labelled Long Method and Long Parameter List examples; its code is recovered via the </w:t>
+      </w:r>
+      <w:proofErr w:type="spellStart"/>
+      <w:r>
+        <w:t>NatthidaW</w:t>
+      </w:r>
+      <w:proofErr w:type="spellEnd"/>
+      <w:r>
+        <w:t xml:space="preserve"> companion repo, which records each project's exact version.</w:t>
       </w:r>
     </w:p>
     <w:p>
@@ -2660,8 +3323,13 @@
         <w:spacing w:after="120"/>
         <w:jc w:val="both"/>
       </w:pPr>
-      <w:r>
-        <w:t xml:space="preserve">SmellyCodeDataset is kept only as a quick test of the pipeline. </w:t>
+      <w:proofErr w:type="spellStart"/>
+      <w:r>
+        <w:t>SmellyCodeDataset</w:t>
+      </w:r>
+      <w:proofErr w:type="spellEnd"/>
+      <w:r>
+        <w:t xml:space="preserve"> is kept only as a quick test of the pipeline. </w:t>
       </w:r>
     </w:p>
     <w:p>
@@ -3257,7 +3925,27 @@
                 <w:sz w:val="20"/>
                 <w:szCs w:val="20"/>
               </w:rPr>
-              <w:t>Combine two or three simple, independent boolean checks that would normally be written as separate guard clauses into a single compound expression using nested AND / OR logic.</w:t>
+              <w:t xml:space="preserve">Combine two or three simple, independent </w:t>
+            </w:r>
+            <w:proofErr w:type="spellStart"/>
+            <w:r>
+              <w:rPr>
+                <w:rFonts w:eastAsia="Arial" w:cs="Times New Roman"/>
+                <w:color w:val="1A1A2E"/>
+                <w:sz w:val="20"/>
+                <w:szCs w:val="20"/>
+              </w:rPr>
+              <w:t>boolean</w:t>
+            </w:r>
+            <w:proofErr w:type="spellEnd"/>
+            <w:r>
+              <w:rPr>
+                <w:rFonts w:eastAsia="Arial" w:cs="Times New Roman"/>
+                <w:color w:val="1A1A2E"/>
+                <w:sz w:val="20"/>
+                <w:szCs w:val="20"/>
+              </w:rPr>
+              <w:t xml:space="preserve"> checks that would normally be written as separate guard clauses into a single compound expression using nested AND / OR logic.</w:t>
             </w:r>
           </w:p>
         </w:tc>
@@ -3304,7 +3992,23 @@
         <w:jc w:val="both"/>
       </w:pPr>
       <w:r>
-        <w:t>The clean reference solutions come from two standard Python datasets, MBPP and HumanEval, whose sample answers are short, self-contained, and written to be correct. Because these contain very few list comprehensions or list copies, the two performance smells that depend on them are topped up from CodeSearchNet, a large collection of real Python functions from open-source projects on GitHub. Each reference is first checked to be free of every target smell; the smell is then injected and re-checked by the tool, so a smelly sample differs from its clean version by exactly one smell.</w:t>
+        <w:t xml:space="preserve">The clean reference solutions come from two standard Python datasets, MBPP and </w:t>
+      </w:r>
+      <w:proofErr w:type="spellStart"/>
+      <w:r>
+        <w:t>HumanEval</w:t>
+      </w:r>
+      <w:proofErr w:type="spellEnd"/>
+      <w:r>
+        <w:t xml:space="preserve">, whose sample answers are short, self-contained, and written to be correct. Because these contain very few list comprehensions or list copies, the two performance smells that depend on them are topped up from </w:t>
+      </w:r>
+      <w:proofErr w:type="spellStart"/>
+      <w:r>
+        <w:t>CodeSearchNet</w:t>
+      </w:r>
+      <w:proofErr w:type="spellEnd"/>
+      <w:r>
+        <w:t>, a large collection of real Python functions from open-source projects on GitHub. Each reference is first checked to be free of every target smell; the smell is then injected and re-checked by the tool, so a smelly sample differs from its clean version by exactly one smell.</w:t>
       </w:r>
     </w:p>
     <w:p>
@@ -3343,7 +4047,15 @@
         <w:t xml:space="preserve">Note: </w:t>
       </w:r>
       <w:r>
-        <w:t>only one label source is required per smell. The performance-related smells are mostly absent from existing datasets since those datasets were built from Pylint, which does not detect them.</w:t>
+        <w:t xml:space="preserve">only one label source is required per smell. The performance-related smells are mostly absent from existing datasets since those datasets were built from </w:t>
+      </w:r>
+      <w:proofErr w:type="spellStart"/>
+      <w:r>
+        <w:t>Pylint</w:t>
+      </w:r>
+      <w:proofErr w:type="spellEnd"/>
+      <w:r>
+        <w:t>, which does not detect them.</w:t>
       </w:r>
     </w:p>
     <w:tbl>
@@ -3464,7 +4176,15 @@
           </w:tcPr>
           <w:p>
             <w:r>
-              <w:t>Yes – PySmell, CS-1.0</w:t>
+              <w:t xml:space="preserve">Yes – </w:t>
+            </w:r>
+            <w:proofErr w:type="spellStart"/>
+            <w:r>
+              <w:t>PySmell</w:t>
+            </w:r>
+            <w:proofErr w:type="spellEnd"/>
+            <w:r>
+              <w:t>, CS-1.0</w:t>
             </w:r>
           </w:p>
         </w:tc>
@@ -3474,7 +4194,15 @@
           </w:tcPr>
           <w:p>
             <w:r>
-              <w:t>Radon (SLOC), Pylint R0915</w:t>
+              <w:t xml:space="preserve">Radon (SLOC), </w:t>
+            </w:r>
+            <w:proofErr w:type="spellStart"/>
+            <w:r>
+              <w:t>Pylint</w:t>
+            </w:r>
+            <w:proofErr w:type="spellEnd"/>
+            <w:r>
+              <w:t xml:space="preserve"> R0915</w:t>
             </w:r>
           </w:p>
         </w:tc>
@@ -3516,8 +4244,13 @@
           </w:tcPr>
           <w:p>
             <w:r>
-              <w:t>Yes – CS-2.0, CS-1.0, PySmell</w:t>
-            </w:r>
+              <w:t xml:space="preserve">Yes – CS-2.0, CS-1.0, </w:t>
+            </w:r>
+            <w:proofErr w:type="spellStart"/>
+            <w:r>
+              <w:t>PySmell</w:t>
+            </w:r>
+            <w:proofErr w:type="spellEnd"/>
           </w:p>
         </w:tc>
         <w:tc>
@@ -3525,8 +4258,13 @@
             <w:tcW w:w="2232" w:type="dxa"/>
           </w:tcPr>
           <w:p>
-            <w:r>
-              <w:t>Pylint R0913</w:t>
+            <w:proofErr w:type="spellStart"/>
+            <w:r>
+              <w:t>Pylint</w:t>
+            </w:r>
+            <w:proofErr w:type="spellEnd"/>
+            <w:r>
+              <w:t xml:space="preserve"> R0913</w:t>
             </w:r>
           </w:p>
         </w:tc>
@@ -3577,8 +4315,13 @@
             <w:tcW w:w="2232" w:type="dxa"/>
           </w:tcPr>
           <w:p>
-            <w:r>
-              <w:t>Pylint R1702</w:t>
+            <w:proofErr w:type="spellStart"/>
+            <w:r>
+              <w:t>Pylint</w:t>
+            </w:r>
+            <w:proofErr w:type="spellEnd"/>
+            <w:r>
+              <w:t xml:space="preserve"> R1702</w:t>
             </w:r>
           </w:p>
         </w:tc>
@@ -3630,7 +4373,15 @@
           </w:tcPr>
           <w:p>
             <w:r>
-              <w:t>Radon CC, Pylint R0916</w:t>
+              <w:t xml:space="preserve">Radon CC, </w:t>
+            </w:r>
+            <w:proofErr w:type="spellStart"/>
+            <w:r>
+              <w:t>Pylint</w:t>
+            </w:r>
+            <w:proofErr w:type="spellEnd"/>
+            <w:r>
+              <w:t xml:space="preserve"> R0916</w:t>
             </w:r>
           </w:p>
         </w:tc>
@@ -3681,8 +4432,21 @@
             <w:tcW w:w="2232" w:type="dxa"/>
           </w:tcPr>
           <w:p>
-            <w:r>
-              <w:t>jscpd, Pylint R0801</w:t>
+            <w:proofErr w:type="spellStart"/>
+            <w:r>
+              <w:t>jscpd</w:t>
+            </w:r>
+            <w:proofErr w:type="spellEnd"/>
+            <w:r>
+              <w:t xml:space="preserve">, </w:t>
+            </w:r>
+            <w:proofErr w:type="spellStart"/>
+            <w:r>
+              <w:t>Pylint</w:t>
+            </w:r>
+            <w:proofErr w:type="spellEnd"/>
+            <w:r>
+              <w:t xml:space="preserve"> R0801</w:t>
             </w:r>
           </w:p>
         </w:tc>
@@ -3733,8 +4497,13 @@
             <w:tcW w:w="2232" w:type="dxa"/>
           </w:tcPr>
           <w:p>
-            <w:r>
-              <w:t>Pylint W0718 / W0719</w:t>
+            <w:proofErr w:type="spellStart"/>
+            <w:r>
+              <w:t>Pylint</w:t>
+            </w:r>
+            <w:proofErr w:type="spellEnd"/>
+            <w:r>
+              <w:t xml:space="preserve"> W0718 / W0719</w:t>
             </w:r>
           </w:p>
         </w:tc>
@@ -3786,7 +4555,15 @@
           </w:tcPr>
           <w:p>
             <w:r>
-              <w:t>Vulture, Pylint W0612 / W0611</w:t>
+              <w:t xml:space="preserve">Vulture, </w:t>
+            </w:r>
+            <w:proofErr w:type="spellStart"/>
+            <w:r>
+              <w:t>Pylint</w:t>
+            </w:r>
+            <w:proofErr w:type="spellEnd"/>
+            <w:r>
+              <w:t xml:space="preserve"> W0612 / W0611</w:t>
             </w:r>
           </w:p>
         </w:tc>
@@ -3993,8 +4770,13 @@
             <w:tcW w:w="2232" w:type="dxa"/>
           </w:tcPr>
           <w:p>
-            <w:r>
-              <w:t>Pylint W0102, bugbear B006</w:t>
+            <w:proofErr w:type="spellStart"/>
+            <w:r>
+              <w:t>Pylint</w:t>
+            </w:r>
+            <w:proofErr w:type="spellEnd"/>
+            <w:r>
+              <w:t xml:space="preserve"> W0102, bugbear B006</w:t>
             </w:r>
           </w:p>
         </w:tc>
@@ -4057,7 +4839,35 @@
         <w:rPr>
           <w:i/>
         </w:rPr>
-        <w:t>CS-2.0 = CodeSmellData 2.0; CS-1.0 = CodeSmellData 1.0.</w:t>
+        <w:t xml:space="preserve">CS-2.0 = </w:t>
+      </w:r>
+      <w:proofErr w:type="spellStart"/>
+      <w:r>
+        <w:rPr>
+          <w:i/>
+        </w:rPr>
+        <w:t>CodeSmellData</w:t>
+      </w:r>
+      <w:proofErr w:type="spellEnd"/>
+      <w:r>
+        <w:rPr>
+          <w:i/>
+        </w:rPr>
+        <w:t xml:space="preserve"> 2.0; CS-1.0 = </w:t>
+      </w:r>
+      <w:proofErr w:type="spellStart"/>
+      <w:r>
+        <w:rPr>
+          <w:i/>
+        </w:rPr>
+        <w:t>CodeSmellData</w:t>
+      </w:r>
+      <w:proofErr w:type="spellEnd"/>
+      <w:r>
+        <w:rPr>
+          <w:i/>
+        </w:rPr>
+        <w:t xml:space="preserve"> 1.0.</w:t>
       </w:r>
     </w:p>
     <w:p>
@@ -4170,7 +4980,15 @@
           </w:tcPr>
           <w:p>
             <w:r>
-              <w:t>github.com/rubik/radon</w:t>
+              <w:t>github.com/</w:t>
+            </w:r>
+            <w:proofErr w:type="spellStart"/>
+            <w:r>
+              <w:t>rubik</w:t>
+            </w:r>
+            <w:proofErr w:type="spellEnd"/>
+            <w:r>
+              <w:t>/radon</w:t>
             </w:r>
           </w:p>
         </w:tc>
@@ -4181,9 +4999,11 @@
             <w:tcW w:w="2232" w:type="dxa"/>
           </w:tcPr>
           <w:p>
+            <w:proofErr w:type="spellStart"/>
             <w:r>
               <w:t>Pylint</w:t>
             </w:r>
+            <w:proofErr w:type="spellEnd"/>
           </w:p>
         </w:tc>
         <w:tc>
@@ -4245,9 +5065,11 @@
             <w:tcW w:w="2232" w:type="dxa"/>
           </w:tcPr>
           <w:p>
+            <w:proofErr w:type="spellStart"/>
             <w:r>
               <w:t>perflint</w:t>
             </w:r>
+            <w:proofErr w:type="spellEnd"/>
           </w:p>
         </w:tc>
         <w:tc>
@@ -4255,8 +5077,13 @@
             <w:tcW w:w="4392" w:type="dxa"/>
           </w:tcPr>
           <w:p>
-            <w:r>
-              <w:t>Pylint plugin for performance anti-patterns (loops, list casting, try/except in loops)</w:t>
+            <w:proofErr w:type="spellStart"/>
+            <w:r>
+              <w:t>Pylint</w:t>
+            </w:r>
+            <w:proofErr w:type="spellEnd"/>
+            <w:r>
+              <w:t xml:space="preserve"> plugin for performance anti-patterns (loops, list casting, try/except in loops)</w:t>
             </w:r>
           </w:p>
         </w:tc>
@@ -4266,8 +5093,21 @@
           </w:tcPr>
           <w:p>
             <w:r>
-              <w:t>github.com/tonybaloney/perflint</w:t>
-            </w:r>
+              <w:t>github.com/</w:t>
+            </w:r>
+            <w:proofErr w:type="spellStart"/>
+            <w:r>
+              <w:t>tonybaloney</w:t>
+            </w:r>
+            <w:proofErr w:type="spellEnd"/>
+            <w:r>
+              <w:t>/</w:t>
+            </w:r>
+            <w:proofErr w:type="spellStart"/>
+            <w:r>
+              <w:t>perflint</w:t>
+            </w:r>
+            <w:proofErr w:type="spellEnd"/>
           </w:p>
         </w:tc>
       </w:tr>
@@ -4330,7 +5170,15 @@
           </w:tcPr>
           <w:p>
             <w:r>
-              <w:t>github.com/jendrikseipp/vulture</w:t>
+              <w:t>github.com/</w:t>
+            </w:r>
+            <w:proofErr w:type="spellStart"/>
+            <w:r>
+              <w:t>jendrikseipp</w:t>
+            </w:r>
+            <w:proofErr w:type="spellEnd"/>
+            <w:r>
+              <w:t>/vulture</w:t>
             </w:r>
           </w:p>
         </w:tc>
@@ -4362,7 +5210,15 @@
           </w:tcPr>
           <w:p>
             <w:r>
-              <w:t>github.com/dosisod/refurb</w:t>
+              <w:t>github.com/</w:t>
+            </w:r>
+            <w:proofErr w:type="spellStart"/>
+            <w:r>
+              <w:t>dosisod</w:t>
+            </w:r>
+            <w:proofErr w:type="spellEnd"/>
+            <w:r>
+              <w:t>/refurb</w:t>
             </w:r>
           </w:p>
         </w:tc>
@@ -4384,7 +5240,31 @@
           </w:tcPr>
           <w:p>
             <w:r>
-              <w:t>Aggregates Pylint, pyflakes, mccabe, dodgy, etc. into one run</w:t>
+              <w:t xml:space="preserve">Aggregates </w:t>
+            </w:r>
+            <w:proofErr w:type="spellStart"/>
+            <w:r>
+              <w:t>Pylint</w:t>
+            </w:r>
+            <w:proofErr w:type="spellEnd"/>
+            <w:r>
+              <w:t xml:space="preserve">, </w:t>
+            </w:r>
+            <w:proofErr w:type="spellStart"/>
+            <w:r>
+              <w:t>pyflakes</w:t>
+            </w:r>
+            <w:proofErr w:type="spellEnd"/>
+            <w:r>
+              <w:t xml:space="preserve">, </w:t>
+            </w:r>
+            <w:proofErr w:type="spellStart"/>
+            <w:r>
+              <w:t>mccabe</w:t>
+            </w:r>
+            <w:proofErr w:type="spellEnd"/>
+            <w:r>
+              <w:t>, dodgy, etc. into one run</w:t>
             </w:r>
           </w:p>
         </w:tc>
@@ -4394,7 +5274,15 @@
           </w:tcPr>
           <w:p>
             <w:r>
-              <w:t>github.com/PyCQA/prospector</w:t>
+              <w:t>github.com/</w:t>
+            </w:r>
+            <w:proofErr w:type="spellStart"/>
+            <w:r>
+              <w:t>PyCQA</w:t>
+            </w:r>
+            <w:proofErr w:type="spellEnd"/>
+            <w:r>
+              <w:t>/prospector</w:t>
             </w:r>
           </w:p>
         </w:tc>
@@ -4405,9 +5293,11 @@
             <w:tcW w:w="2232" w:type="dxa"/>
           </w:tcPr>
           <w:p>
+            <w:proofErr w:type="spellStart"/>
             <w:r>
               <w:t>mccabe</w:t>
             </w:r>
+            <w:proofErr w:type="spellEnd"/>
           </w:p>
         </w:tc>
         <w:tc>
@@ -4426,8 +5316,21 @@
           </w:tcPr>
           <w:p>
             <w:r>
-              <w:t>github.com/PyCQA/mccabe</w:t>
-            </w:r>
+              <w:t>github.com/</w:t>
+            </w:r>
+            <w:proofErr w:type="spellStart"/>
+            <w:r>
+              <w:t>PyCQA</w:t>
+            </w:r>
+            <w:proofErr w:type="spellEnd"/>
+            <w:r>
+              <w:t>/</w:t>
+            </w:r>
+            <w:proofErr w:type="spellStart"/>
+            <w:r>
+              <w:t>mccabe</w:t>
+            </w:r>
+            <w:proofErr w:type="spellEnd"/>
           </w:p>
         </w:tc>
       </w:tr>
@@ -4437,9 +5340,11 @@
             <w:tcW w:w="2232" w:type="dxa"/>
           </w:tcPr>
           <w:p>
+            <w:proofErr w:type="spellStart"/>
             <w:r>
               <w:t>jscpd</w:t>
             </w:r>
+            <w:proofErr w:type="spellEnd"/>
           </w:p>
         </w:tc>
         <w:tc>
@@ -4458,8 +5363,21 @@
           </w:tcPr>
           <w:p>
             <w:r>
-              <w:t>github.com/kucherenko/jscpd</w:t>
-            </w:r>
+              <w:t>github.com/</w:t>
+            </w:r>
+            <w:proofErr w:type="spellStart"/>
+            <w:r>
+              <w:t>kucherenko</w:t>
+            </w:r>
+            <w:proofErr w:type="spellEnd"/>
+            <w:r>
+              <w:t>/</w:t>
+            </w:r>
+            <w:proofErr w:type="spellStart"/>
+            <w:r>
+              <w:t>jscpd</w:t>
+            </w:r>
+            <w:proofErr w:type="spellEnd"/>
           </w:p>
         </w:tc>
       </w:tr>
@@ -4470,8 +5388,13 @@
           </w:tcPr>
           <w:p>
             <w:r>
-              <w:t>SonarQube / SonarPython</w:t>
-            </w:r>
+              <w:t xml:space="preserve">SonarQube / </w:t>
+            </w:r>
+            <w:proofErr w:type="spellStart"/>
+            <w:r>
+              <w:t>SonarPython</w:t>
+            </w:r>
+            <w:proofErr w:type="spellEnd"/>
           </w:p>
         </w:tc>
         <w:tc>
@@ -4501,8 +5424,13 @@
             <w:tcW w:w="2232" w:type="dxa"/>
           </w:tcPr>
           <w:p>
-            <w:r>
-              <w:t>PyExamine (research)</w:t>
+            <w:proofErr w:type="spellStart"/>
+            <w:r>
+              <w:t>PyExamine</w:t>
+            </w:r>
+            <w:proofErr w:type="spellEnd"/>
+            <w:r>
+              <w:t xml:space="preserve"> (research)</w:t>
             </w:r>
           </w:p>
         </w:tc>
@@ -4588,9 +5516,11 @@
             <w:tcW w:w="2448" w:type="dxa"/>
           </w:tcPr>
           <w:p>
+            <w:proofErr w:type="spellStart"/>
             <w:r>
               <w:t>Pylint</w:t>
             </w:r>
+            <w:proofErr w:type="spellEnd"/>
           </w:p>
         </w:tc>
         <w:tc>
@@ -4662,9 +5592,11 @@
             <w:tcW w:w="2448" w:type="dxa"/>
           </w:tcPr>
           <w:p>
+            <w:proofErr w:type="spellStart"/>
             <w:r>
               <w:t>jscpd</w:t>
             </w:r>
+            <w:proofErr w:type="spellEnd"/>
           </w:p>
         </w:tc>
         <w:tc>
@@ -4703,7 +5635,23 @@
     </w:tbl>
     <w:p>
       <w:r>
-        <w:t>A few other tools were left out to avoid overlap. Refurb only suggests tidier ways to write working code rather than finding smells. mccabe's complexity check is already covered by Radon. Flake8 and Prospector are mostly replaced by Ruff. perflint does the same job as Ruff's performance checks but is still an early beta that reports many false alarms. SonarQube is a paid tool and is server-based which may be harder to use.</w:t>
+        <w:t xml:space="preserve">A few other tools were left out to avoid overlap. Refurb only suggests tidier ways to write working code rather than finding smells. </w:t>
+      </w:r>
+      <w:proofErr w:type="spellStart"/>
+      <w:r>
+        <w:t>mccabe's</w:t>
+      </w:r>
+      <w:proofErr w:type="spellEnd"/>
+      <w:r>
+        <w:t xml:space="preserve"> complexity check is already covered by Radon. Flake8 and Prospector are mostly replaced by Ruff. </w:t>
+      </w:r>
+      <w:proofErr w:type="spellStart"/>
+      <w:r>
+        <w:t>perflint</w:t>
+      </w:r>
+      <w:proofErr w:type="spellEnd"/>
+      <w:r>
+        <w:t xml:space="preserve"> does the same job as Ruff's performance checks but is still an early beta that reports many false alarms. SonarQube is a paid tool and is server-based which may be harder to use.</w:t>
       </w:r>
     </w:p>
     <w:p>
@@ -4728,11 +5676,19 @@
           <w:numId w:val="10"/>
         </w:numPr>
       </w:pPr>
+      <w:proofErr w:type="spellStart"/>
       <w:r>
         <w:rPr>
           <w:b/>
         </w:rPr>
-        <w:t xml:space="preserve">CodeBLEU </w:t>
+        <w:t>CodeBLEU</w:t>
+      </w:r>
+      <w:proofErr w:type="spellEnd"/>
+      <w:r>
+        <w:rPr>
+          <w:b/>
+        </w:rPr>
+        <w:t xml:space="preserve"> </w:t>
       </w:r>
       <w:r>
         <w:t xml:space="preserve">(Ren et al., 2020) – extends BLEU with syntax matching (via the abstract syntax tree) and data-flow matching, so it rewards code that is structurally, not just textually, similar to the reference. </w:t>
@@ -4746,14 +5702,38 @@
           <w:numId w:val="10"/>
         </w:numPr>
       </w:pPr>
+      <w:proofErr w:type="spellStart"/>
       <w:r>
         <w:rPr>
           <w:b/>
         </w:rPr>
-        <w:t xml:space="preserve">CodeBERTScore </w:t>
-      </w:r>
-      <w:r>
-        <w:t xml:space="preserve">(Zhou et al., 2023) – applies BERTScore to code using CodeBERT embeddings; reported to correlate with functional correctness and human preference better than earlier metrics. </w:t>
+        <w:t>CodeBERTScore</w:t>
+      </w:r>
+      <w:proofErr w:type="spellEnd"/>
+      <w:r>
+        <w:rPr>
+          <w:b/>
+        </w:rPr>
+        <w:t xml:space="preserve"> </w:t>
+      </w:r>
+      <w:r>
+        <w:t xml:space="preserve">(Zhou et al., 2023) – applies </w:t>
+      </w:r>
+      <w:proofErr w:type="spellStart"/>
+      <w:r>
+        <w:t>BERTScore</w:t>
+      </w:r>
+      <w:proofErr w:type="spellEnd"/>
+      <w:r>
+        <w:t xml:space="preserve"> to code using </w:t>
+      </w:r>
+      <w:proofErr w:type="spellStart"/>
+      <w:r>
+        <w:t>CodeBERT</w:t>
+      </w:r>
+      <w:proofErr w:type="spellEnd"/>
+      <w:r>
+        <w:t xml:space="preserve"> embeddings; reported to correlate with functional correctness and human preference better than earlier metrics. </w:t>
       </w:r>
     </w:p>
     <w:p>
@@ -4769,7 +5749,39 @@
           <w:i/>
           <w:iCs/>
         </w:rPr>
-        <w:t xml:space="preserve">Code at: github.com/neulab/code-bert-score </w:t>
+        <w:t>Code at: github.com/</w:t>
+      </w:r>
+      <w:proofErr w:type="spellStart"/>
+      <w:r>
+        <w:rPr>
+          <w:i/>
+          <w:iCs/>
+        </w:rPr>
+        <w:t>neulab</w:t>
+      </w:r>
+      <w:proofErr w:type="spellEnd"/>
+      <w:r>
+        <w:rPr>
+          <w:i/>
+          <w:iCs/>
+        </w:rPr>
+        <w:t>/code-</w:t>
+      </w:r>
+      <w:proofErr w:type="spellStart"/>
+      <w:r>
+        <w:rPr>
+          <w:i/>
+          <w:iCs/>
+        </w:rPr>
+        <w:t>bert</w:t>
+      </w:r>
+      <w:proofErr w:type="spellEnd"/>
+      <w:r>
+        <w:rPr>
+          <w:i/>
+          <w:iCs/>
+        </w:rPr>
+        <w:t xml:space="preserve">-score </w:t>
       </w:r>
     </w:p>
     <w:p>
@@ -4800,7 +5812,15 @@
         <w:t xml:space="preserve">BLEU </w:t>
       </w:r>
       <w:r>
-        <w:t>(Papineni et al., 2002) – precision of overlapping word n-grams against the reference.</w:t>
+        <w:t>(</w:t>
+      </w:r>
+      <w:proofErr w:type="spellStart"/>
+      <w:r>
+        <w:t>Papineni</w:t>
+      </w:r>
+      <w:proofErr w:type="spellEnd"/>
+      <w:r>
+        <w:t xml:space="preserve"> et al., 2002) – precision of overlapping word n-grams against the reference.</w:t>
       </w:r>
     </w:p>
     <w:p>
@@ -4847,11 +5867,19 @@
           <w:numId w:val="11"/>
         </w:numPr>
       </w:pPr>
+      <w:proofErr w:type="spellStart"/>
       <w:r>
         <w:rPr>
           <w:b/>
         </w:rPr>
-        <w:t xml:space="preserve">ChrF </w:t>
+        <w:t>ChrF</w:t>
+      </w:r>
+      <w:proofErr w:type="spellEnd"/>
+      <w:r>
+        <w:rPr>
+          <w:b/>
+        </w:rPr>
+        <w:t xml:space="preserve"> </w:t>
       </w:r>
       <w:r>
         <w:t>(Popović, 2015) – character-level n-gram F-score; robust to small token differences.</w:t>
@@ -4869,7 +5897,21 @@
         <w:rPr>
           <w:b/>
         </w:rPr>
-        <w:t xml:space="preserve">Embedding similarity / BERTScore </w:t>
+        <w:t xml:space="preserve">Embedding similarity / </w:t>
+      </w:r>
+      <w:proofErr w:type="spellStart"/>
+      <w:r>
+        <w:rPr>
+          <w:b/>
+        </w:rPr>
+        <w:t>BERTScore</w:t>
+      </w:r>
+      <w:proofErr w:type="spellEnd"/>
+      <w:r>
+        <w:rPr>
+          <w:b/>
+        </w:rPr>
+        <w:t xml:space="preserve"> </w:t>
       </w:r>
       <w:r>
         <w:t>(Zhang et al., 2020) – cosine similarity between contextual token embeddings of the two texts.</w:t>
@@ -4903,7 +5945,15 @@
     </w:p>
     <w:p>
       <w:r>
-        <w:t xml:space="preserve">Some research detects code smells with LLM-based models instead of fixed rules (for example Sharma et al., 2021, and the review by Alazba et al., 2023). I include these for background but do not use them to make our labels. A model-based detector can be swayed by its training data and by how the input is written, which would make the labels less reliable. </w:t>
+        <w:t xml:space="preserve">Some research detects code smells with LLM-based models instead of fixed rules (for example Sharma et al., 2021, and the review by </w:t>
+      </w:r>
+      <w:proofErr w:type="spellStart"/>
+      <w:r>
+        <w:t>Alazba</w:t>
+      </w:r>
+      <w:proofErr w:type="spellEnd"/>
+      <w:r>
+        <w:t xml:space="preserve"> et al., 2023). I include these for background but do not use them to make our labels. A model-based detector can be swayed by its training data and by how the input is written, which would make the labels less reliable. </w:t>
       </w:r>
     </w:p>
     <w:p>
@@ -4929,7 +5979,15 @@
         </w:numPr>
       </w:pPr>
       <w:r>
-        <w:t xml:space="preserve">Velasco, A., Rodriguez-Cardenas, D., Alif, L. R., Palacio, D. N., &amp; Poshyvanyk, D. (2025). How propense are large language models at producing code smells? A benchmarking study. In </w:t>
+        <w:t xml:space="preserve">Velasco, A., Rodriguez-Cardenas, D., Alif, L. R., Palacio, D. N., &amp; </w:t>
+      </w:r>
+      <w:proofErr w:type="spellStart"/>
+      <w:r>
+        <w:t>Poshyvanyk</w:t>
+      </w:r>
+      <w:proofErr w:type="spellEnd"/>
+      <w:r>
+        <w:t xml:space="preserve">, D. (2025). How propense are large language models at producing code smells? A benchmarking study. In </w:t>
       </w:r>
       <w:r>
         <w:rPr>
@@ -4969,7 +6027,15 @@
         <w:t>Investigating the smells of LLM generated code</w:t>
       </w:r>
       <w:r>
-        <w:t xml:space="preserve"> (arXiv:2510.03029). arXiv. </w:t>
+        <w:t xml:space="preserve"> (arXiv:2510.03029). </w:t>
+      </w:r>
+      <w:proofErr w:type="spellStart"/>
+      <w:r>
+        <w:t>arXiv</w:t>
+      </w:r>
+      <w:proofErr w:type="spellEnd"/>
+      <w:r>
+        <w:t xml:space="preserve">. </w:t>
       </w:r>
       <w:hyperlink r:id="rId16" w:history="1">
         <w:r>
@@ -5057,7 +6123,15 @@
         </w:numPr>
       </w:pPr>
       <w:r>
-        <w:t xml:space="preserve">Velasco, A., Palacio, D. N., Rodriguez-Cardenas, D., Alif, L. R., Khati, D., &amp; Poshyvanyk, D. (2025). </w:t>
+        <w:t xml:space="preserve">Velasco, A., Palacio, D. N., Rodriguez-Cardenas, D., Alif, L. R., Khati, D., &amp; </w:t>
+      </w:r>
+      <w:proofErr w:type="spellStart"/>
+      <w:r>
+        <w:t>Poshyvanyk</w:t>
+      </w:r>
+      <w:proofErr w:type="spellEnd"/>
+      <w:r>
+        <w:t xml:space="preserve">, D. (2025). </w:t>
       </w:r>
       <w:r>
         <w:rPr>
@@ -5067,7 +6141,15 @@
         <w:t>A causal perspective on measuring, explaining and mitigating smells in LLM-generated code</w:t>
       </w:r>
       <w:r>
-        <w:t xml:space="preserve"> (arXiv:2511.15817). arXiv. </w:t>
+        <w:t xml:space="preserve"> (arXiv:2511.15817). </w:t>
+      </w:r>
+      <w:proofErr w:type="spellStart"/>
+      <w:r>
+        <w:t>arXiv</w:t>
+      </w:r>
+      <w:proofErr w:type="spellEnd"/>
+      <w:r>
+        <w:t xml:space="preserve">. </w:t>
       </w:r>
       <w:hyperlink r:id="rId19" w:history="1">
         <w:r>
@@ -5093,7 +6175,15 @@
         <w:t>Dataset/code repository</w:t>
       </w:r>
       <w:r>
-        <w:t xml:space="preserve">: github.com/WM-SEMERU/CodeSmellExt </w:t>
+        <w:t>: github.com/WM-SEMERU/</w:t>
+      </w:r>
+      <w:proofErr w:type="spellStart"/>
+      <w:r>
+        <w:t>CodeSmellExt</w:t>
+      </w:r>
+      <w:proofErr w:type="spellEnd"/>
+      <w:r>
+        <w:t xml:space="preserve"> </w:t>
       </w:r>
     </w:p>
     <w:p>
@@ -5138,7 +6228,15 @@
         </w:numPr>
       </w:pPr>
       <w:r>
-        <w:t>Ren, S., Guo, D., Lu, S., et al. (2020). CodeBLEU: a Method for Automatic Evaluation of Code Synthesis. arXiv:2009.10297.</w:t>
+        <w:t xml:space="preserve">Ren, S., Guo, D., Lu, S., et al. (2020). </w:t>
+      </w:r>
+      <w:proofErr w:type="spellStart"/>
+      <w:r>
+        <w:t>CodeBLEU</w:t>
+      </w:r>
+      <w:proofErr w:type="spellEnd"/>
+      <w:r>
+        <w:t>: a Method for Automatic Evaluation of Code Synthesis. arXiv:2009.10297.</w:t>
       </w:r>
     </w:p>
     <w:p>
@@ -5150,7 +6248,15 @@
         </w:numPr>
       </w:pPr>
       <w:r>
-        <w:t>Zhou, S., Alon, U., Agarwal, S., &amp; Neubig, G. (2023). CodeBERTScore: Evaluating Code Generation with Pretrained Models of Code. Findings of EMNLP 2023. arXiv:2302.05527.</w:t>
+        <w:t xml:space="preserve">Zhou, S., Alon, U., Agarwal, S., &amp; Neubig, G. (2023). </w:t>
+      </w:r>
+      <w:proofErr w:type="spellStart"/>
+      <w:r>
+        <w:t>CodeBERTScore</w:t>
+      </w:r>
+      <w:proofErr w:type="spellEnd"/>
+      <w:r>
+        <w:t>: Evaluating Code Generation with Pretrained Models of Code. Findings of EMNLP 2023. arXiv:2302.05527.</w:t>
       </w:r>
     </w:p>
     <w:p>
@@ -5161,8 +6267,21 @@
           <w:numId w:val="3"/>
         </w:numPr>
       </w:pPr>
-      <w:r>
-        <w:t>Papineni, K., Roukos, S., Ward, T., &amp; Zhu, W. (2002). BLEU: a Method for Automatic Evaluation of Machine Translation. ACL 2002.</w:t>
+      <w:proofErr w:type="spellStart"/>
+      <w:r>
+        <w:t>Papineni</w:t>
+      </w:r>
+      <w:proofErr w:type="spellEnd"/>
+      <w:r>
+        <w:t xml:space="preserve">, K., </w:t>
+      </w:r>
+      <w:proofErr w:type="spellStart"/>
+      <w:r>
+        <w:t>Roukos</w:t>
+      </w:r>
+      <w:proofErr w:type="spellEnd"/>
+      <w:r>
+        <w:t>, S., Ward, T., &amp; Zhu, W. (2002). BLEU: a Method for Automatic Evaluation of Machine Translation. ACL 2002.</w:t>
       </w:r>
     </w:p>
     <w:p>
@@ -5198,7 +6317,15 @@
         </w:numPr>
       </w:pPr>
       <w:r>
-        <w:t>Popovic, M. (2015). chrF: character n-gram F-score for automatic MT evaluation. WMT 2015.</w:t>
+        <w:t xml:space="preserve">Popovic, M. (2015). </w:t>
+      </w:r>
+      <w:proofErr w:type="spellStart"/>
+      <w:r>
+        <w:t>chrF</w:t>
+      </w:r>
+      <w:proofErr w:type="spellEnd"/>
+      <w:r>
+        <w:t>: character n-gram F-score for automatic MT evaluation. WMT 2015.</w:t>
       </w:r>
     </w:p>
     <w:p>
@@ -5210,7 +6337,15 @@
         </w:numPr>
       </w:pPr>
       <w:r>
-        <w:t>Zhang, T., Kishore, V., Wu, F., Weinberger, K., &amp; Artzi, Y. (2020). BERTScore: Evaluating Text Generation with BERT. ICLR 2020. arXiv:1904.09675.</w:t>
+        <w:t xml:space="preserve">Zhang, T., Kishore, V., Wu, F., Weinberger, K., &amp; Artzi, Y. (2020). </w:t>
+      </w:r>
+      <w:proofErr w:type="spellStart"/>
+      <w:r>
+        <w:t>BERTScore</w:t>
+      </w:r>
+      <w:proofErr w:type="spellEnd"/>
+      <w:r>
+        <w:t>: Evaluating Text Generation with BERT. ICLR 2020. arXiv:1904.09675.</w:t>
       </w:r>
     </w:p>
     <w:p>
@@ -5222,7 +6357,15 @@
         </w:numPr>
       </w:pPr>
       <w:r>
-        <w:t>Shivashankar, K., &amp; Martini, A. (2025). PyExamine: A Comprehensive, Un-Opinionated Smell Detection Tool for Python. arXiv:2501.18327.</w:t>
+        <w:t xml:space="preserve">Shivashankar, K., &amp; Martini, A. (2025). </w:t>
+      </w:r>
+      <w:proofErr w:type="spellStart"/>
+      <w:r>
+        <w:t>PyExamine</w:t>
+      </w:r>
+      <w:proofErr w:type="spellEnd"/>
+      <w:r>
+        <w:t>: A Comprehensive, Un-Opinionated Smell Detection Tool for Python. arXiv:2501.18327.</w:t>
       </w:r>
     </w:p>
     <w:p>
@@ -5234,7 +6377,15 @@
         </w:numPr>
       </w:pPr>
       <w:r>
-        <w:t>Sharma, T., Efstathiou, V., Louridas, P., &amp; Spinellis, D. (2021). Code smell detection by deep direct-learning and transfer-learning. Journal of Systems and Software, 176.</w:t>
+        <w:t xml:space="preserve">Sharma, T., Efstathiou, V., Louridas, P., &amp; </w:t>
+      </w:r>
+      <w:proofErr w:type="spellStart"/>
+      <w:r>
+        <w:t>Spinellis</w:t>
+      </w:r>
+      <w:proofErr w:type="spellEnd"/>
+      <w:r>
+        <w:t>, D. (2021). Code smell detection by deep direct-learning and transfer-learning. Journal of Systems and Software, 176.</w:t>
       </w:r>
     </w:p>
     <w:p>
@@ -5245,9 +6396,30 @@
           <w:numId w:val="3"/>
         </w:numPr>
       </w:pPr>
+      <w:proofErr w:type="spellStart"/>
       <w:r>
         <w:lastRenderedPageBreak/>
-        <w:t>Alazba, A., Aljamaan, H., &amp; Alshayeb, M. (2023). Deep learning approaches for bad smell detection: a systematic literature review. Empirical Software Engineering, 28, 77.</w:t>
+        <w:t>Alazba</w:t>
+      </w:r>
+      <w:proofErr w:type="spellEnd"/>
+      <w:r>
+        <w:t xml:space="preserve">, A., </w:t>
+      </w:r>
+      <w:proofErr w:type="spellStart"/>
+      <w:r>
+        <w:t>Aljamaan</w:t>
+      </w:r>
+      <w:proofErr w:type="spellEnd"/>
+      <w:r>
+        <w:t xml:space="preserve">, H., &amp; </w:t>
+      </w:r>
+      <w:proofErr w:type="spellStart"/>
+      <w:r>
+        <w:t>Alshayeb</w:t>
+      </w:r>
+      <w:proofErr w:type="spellEnd"/>
+      <w:r>
+        <w:t>, M. (2023). Deep learning approaches for bad smell detection: a systematic literature review. Empirical Software Engineering, 28, 77.</w:t>
       </w:r>
     </w:p>
     <w:p>
@@ -5348,7 +6520,39 @@
     </w:p>
     <w:p>
       <w:r>
-        <w:t>The clean reference solutions come from MBPP and HumanEval, two standard collections of short, correct Python solutions. The two performance smells need a loop or comprehension to work on, which those sources rarely contain, so they are topped up from CodeSearchNet, a large collection of real functions from GitHub. The final mix is roughly 1,025 from MBPP, 154 from HumanEval, and 121 from CodeSearchNet.</w:t>
+        <w:t xml:space="preserve">The clean reference solutions come from MBPP and </w:t>
+      </w:r>
+      <w:proofErr w:type="spellStart"/>
+      <w:r>
+        <w:t>HumanEval</w:t>
+      </w:r>
+      <w:proofErr w:type="spellEnd"/>
+      <w:r>
+        <w:t xml:space="preserve">, two standard collections of short, correct Python solutions. The two performance smells need a loop or comprehension to work on, which those sources rarely contain, so they are topped up from </w:t>
+      </w:r>
+      <w:proofErr w:type="spellStart"/>
+      <w:r>
+        <w:t>CodeSearchNet</w:t>
+      </w:r>
+      <w:proofErr w:type="spellEnd"/>
+      <w:r>
+        <w:t xml:space="preserve">, a large collection of real functions from GitHub. The final mix is roughly 1,025 from MBPP, 154 from </w:t>
+      </w:r>
+      <w:proofErr w:type="spellStart"/>
+      <w:r>
+        <w:t>HumanEval</w:t>
+      </w:r>
+      <w:proofErr w:type="spellEnd"/>
+      <w:r>
+        <w:t xml:space="preserve">, and 121 from </w:t>
+      </w:r>
+      <w:proofErr w:type="spellStart"/>
+      <w:r>
+        <w:t>CodeSearchNet</w:t>
+      </w:r>
+      <w:proofErr w:type="spellEnd"/>
+      <w:r>
+        <w:t>.</w:t>
       </w:r>
     </w:p>
     <w:p>
@@ -5446,8 +6650,13 @@
             <w:tcW w:w="2016" w:type="dxa"/>
           </w:tcPr>
           <w:p>
-            <w:r>
-              <w:t>Pylint R0915</w:t>
+            <w:proofErr w:type="spellStart"/>
+            <w:r>
+              <w:t>Pylint</w:t>
+            </w:r>
+            <w:proofErr w:type="spellEnd"/>
+            <w:r>
+              <w:t xml:space="preserve"> R0915</w:t>
             </w:r>
           </w:p>
         </w:tc>
@@ -5478,8 +6687,13 @@
             <w:tcW w:w="2016" w:type="dxa"/>
           </w:tcPr>
           <w:p>
-            <w:r>
-              <w:t>Pylint R0913</w:t>
+            <w:proofErr w:type="spellStart"/>
+            <w:r>
+              <w:t>Pylint</w:t>
+            </w:r>
+            <w:proofErr w:type="spellEnd"/>
+            <w:r>
+              <w:t xml:space="preserve"> R0913</w:t>
             </w:r>
           </w:p>
         </w:tc>
@@ -5510,8 +6724,13 @@
             <w:tcW w:w="2016" w:type="dxa"/>
           </w:tcPr>
           <w:p>
-            <w:r>
-              <w:t>Pylint R1702</w:t>
+            <w:proofErr w:type="spellStart"/>
+            <w:r>
+              <w:t>Pylint</w:t>
+            </w:r>
+            <w:proofErr w:type="spellEnd"/>
+            <w:r>
+              <w:t xml:space="preserve"> R1702</w:t>
             </w:r>
           </w:p>
         </w:tc>
@@ -5542,8 +6761,13 @@
             <w:tcW w:w="2016" w:type="dxa"/>
           </w:tcPr>
           <w:p>
-            <w:r>
-              <w:t>Pylint R0916</w:t>
+            <w:proofErr w:type="spellStart"/>
+            <w:r>
+              <w:t>Pylint</w:t>
+            </w:r>
+            <w:proofErr w:type="spellEnd"/>
+            <w:r>
+              <w:t xml:space="preserve"> R0916</w:t>
             </w:r>
           </w:p>
         </w:tc>
@@ -5574,8 +6798,13 @@
             <w:tcW w:w="2016" w:type="dxa"/>
           </w:tcPr>
           <w:p>
-            <w:r>
-              <w:t>Pylint W0718</w:t>
+            <w:proofErr w:type="spellStart"/>
+            <w:r>
+              <w:t>Pylint</w:t>
+            </w:r>
+            <w:proofErr w:type="spellEnd"/>
+            <w:r>
+              <w:t xml:space="preserve"> W0718</w:t>
             </w:r>
           </w:p>
         </w:tc>
@@ -5606,8 +6835,13 @@
             <w:tcW w:w="2016" w:type="dxa"/>
           </w:tcPr>
           <w:p>
-            <w:r>
-              <w:t>Pylint W0611 / W0612</w:t>
+            <w:proofErr w:type="spellStart"/>
+            <w:r>
+              <w:t>Pylint</w:t>
+            </w:r>
+            <w:proofErr w:type="spellEnd"/>
+            <w:r>
+              <w:t xml:space="preserve"> W0611 / W0612</w:t>
             </w:r>
           </w:p>
         </w:tc>
@@ -5638,8 +6872,13 @@
             <w:tcW w:w="2016" w:type="dxa"/>
           </w:tcPr>
           <w:p>
-            <w:r>
-              <w:t>Pylint W0102</w:t>
+            <w:proofErr w:type="spellStart"/>
+            <w:r>
+              <w:t>Pylint</w:t>
+            </w:r>
+            <w:proofErr w:type="spellEnd"/>
+            <w:r>
+              <w:t xml:space="preserve"> W0102</w:t>
             </w:r>
           </w:p>
         </w:tc>
@@ -5649,7 +6888,15 @@
           </w:tcPr>
           <w:p>
             <w:r>
-              <w:t>A list or dict used as a default argument (a classic bug).</w:t>
+              <w:t xml:space="preserve">A list or </w:t>
+            </w:r>
+            <w:proofErr w:type="spellStart"/>
+            <w:r>
+              <w:t>dict</w:t>
+            </w:r>
+            <w:proofErr w:type="spellEnd"/>
+            <w:r>
+              <w:t xml:space="preserve"> used as a default argument (a classic bug).</w:t>
             </w:r>
           </w:p>
         </w:tc>
@@ -5670,8 +6917,13 @@
             <w:tcW w:w="2016" w:type="dxa"/>
           </w:tcPr>
           <w:p>
-            <w:r>
-              <w:t>Pylint R2004</w:t>
+            <w:proofErr w:type="spellStart"/>
+            <w:r>
+              <w:t>Pylint</w:t>
+            </w:r>
+            <w:proofErr w:type="spellEnd"/>
+            <w:r>
+              <w:t xml:space="preserve"> R2004</w:t>
             </w:r>
           </w:p>
         </w:tc>
@@ -5799,9 +7051,11 @@
             <w:tcW w:w="2016" w:type="dxa"/>
           </w:tcPr>
           <w:p>
+            <w:proofErr w:type="spellStart"/>
             <w:r>
               <w:t>jscpd</w:t>
             </w:r>
+            <w:proofErr w:type="spellEnd"/>
           </w:p>
         </w:tc>
         <w:tc>
@@ -5829,7 +7083,15 @@
         <w:jc w:val="both"/>
       </w:pPr>
       <w:r>
-        <w:t xml:space="preserve">Ten of the twelve planned smells are built exactly as listed. Two — String Concatenation in a Loop and Redundant / Loop-invariant Computation — are not, because no off-the-shelf pylint or ruff rule detects them, so they cannot meet the operational definition used here (a smell is whatever an established detector flags). They are stood in for by two performance smells ruff does detect: Inefficient copy (a manual list copy, PERF402) and Try inside a loop (a try/except inside a loop, PERF203). </w:t>
+        <w:t xml:space="preserve">Ten of the twelve planned smells are built exactly as listed. Two — String Concatenation in a Loop and Redundant / Loop-invariant Computation — are not, because no off-the-shelf </w:t>
+      </w:r>
+      <w:proofErr w:type="spellStart"/>
+      <w:r>
+        <w:t>pylint</w:t>
+      </w:r>
+      <w:proofErr w:type="spellEnd"/>
+      <w:r>
+        <w:t xml:space="preserve"> or ruff rule detects them, so they cannot meet the operational definition used here (a smell is whatever an established detector flags). They are stood in for by two performance smells ruff does detect: Inefficient copy (a manual list copy, PERF402) and Try inside a loop (a try/except inside a loop, PERF203). </w:t>
       </w:r>
     </w:p>
     <w:p>
@@ -5842,7 +7104,15 @@
     </w:p>
     <w:p>
       <w:r>
-        <w:t>The magic-number injection adds an inert comparison whose result is discarded — for example, `_ = n == 42`. A discarded computation superficially resembles dead code, but pylint reports this line only as a magic-value comparison (R2004): it treats the underscore as a deliberate throwaway and does not raise an unused-variable warning (W0612). The same line written with an ordinary name (`x = n == 42`) is flagged as both a magic value (R2004) and an unused variable (W0612), and the build's collateral filter would drop such a two-smell sample. The underscore therefore keeps the injection to exactly one detector-confirmed smell — which every injected pair in the benchmark requires.</w:t>
+        <w:t xml:space="preserve">The magic-number injection adds an inert comparison whose result is discarded — for example, `_ = n == 42`. A discarded computation superficially resembles dead code, but </w:t>
+      </w:r>
+      <w:proofErr w:type="spellStart"/>
+      <w:r>
+        <w:t>pylint</w:t>
+      </w:r>
+      <w:proofErr w:type="spellEnd"/>
+      <w:r>
+        <w:t xml:space="preserve"> reports this line only as a magic-value comparison (R2004): it treats the underscore as a deliberate throwaway and does not raise an unused-variable warning (W0612). The same line written with an ordinary name (`x = n == 42`) is flagged as both a magic value (R2004) and an unused variable (W0612), and the build's collateral filter would drop such a two-smell sample. The underscore therefore keeps the injection to exactly one detector-confirmed smell — which every injected pair in the benchmark requires.</w:t>
       </w:r>
     </w:p>
     <w:p/>
@@ -5856,12 +7126,44 @@
     </w:p>
     <w:p>
       <w:r>
-        <w:t>Alongside the injected data, three existing public datasets of real, already-labelled Python functions were imported and merged into a single file. After removing duplicates this gives about 3,975 records. The sources are CodeSmellData 2.0 and 1.0 (labelled by Pylint) and PySmell (labelled by human reviewers, with the actual code recovered from GitHub using each project's exact version).</w:t>
-      </w:r>
-    </w:p>
-    <w:p>
-      <w:r>
-        <w:t>Every record is stored in the same simple shape: an id, the source, the smell, a yes/no label, the code, where the label came from (human or Pylint), and some extra detail. The 'where the label came from' field matters: you cannot grade a tool using labels that tool produced.</w:t>
+        <w:t xml:space="preserve">Alongside the injected data, three existing public datasets of real, already-labelled Python functions were imported and merged into a single file. After removing duplicates this gives about 3,975 records. The sources are </w:t>
+      </w:r>
+      <w:proofErr w:type="spellStart"/>
+      <w:r>
+        <w:t>CodeSmellData</w:t>
+      </w:r>
+      <w:proofErr w:type="spellEnd"/>
+      <w:r>
+        <w:t xml:space="preserve"> 2.0 and 1.0 (labelled by </w:t>
+      </w:r>
+      <w:proofErr w:type="spellStart"/>
+      <w:r>
+        <w:t>Pylint</w:t>
+      </w:r>
+      <w:proofErr w:type="spellEnd"/>
+      <w:r>
+        <w:t xml:space="preserve">) and </w:t>
+      </w:r>
+      <w:proofErr w:type="spellStart"/>
+      <w:r>
+        <w:t>PySmell</w:t>
+      </w:r>
+      <w:proofErr w:type="spellEnd"/>
+      <w:r>
+        <w:t xml:space="preserve"> (labelled by human reviewers, with the actual code recovered from GitHub using each project's exact version).</w:t>
+      </w:r>
+    </w:p>
+    <w:p>
+      <w:r>
+        <w:t xml:space="preserve">Every record is stored in the same simple shape: an id, the source, the smell, a yes/no label, the code, where the label came from (human or </w:t>
+      </w:r>
+      <w:proofErr w:type="spellStart"/>
+      <w:r>
+        <w:t>Pylint</w:t>
+      </w:r>
+      <w:proofErr w:type="spellEnd"/>
+      <w:r>
+        <w:t>), and some extra detail. The 'where the label came from' field matters: you cannot grade a tool using labels that tool produced.</w:t>
       </w:r>
     </w:p>
     <w:p>
@@ -5872,7 +7174,15 @@
         <w:t xml:space="preserve"> </w:t>
       </w:r>
       <w:r>
-        <w:t xml:space="preserve">limitation surfaced here: the human-labelled positive examples in PySmell are very scarce (for example, only two confirmed long-method cases). This means the reused data cannot independently validate the detectors as first hoped. Its role instead is a real-world cross-check for the reference-free measures later on. </w:t>
+        <w:t xml:space="preserve">limitation surfaced here: the human-labelled positive examples in </w:t>
+      </w:r>
+      <w:proofErr w:type="spellStart"/>
+      <w:r>
+        <w:t>PySmell</w:t>
+      </w:r>
+      <w:proofErr w:type="spellEnd"/>
+      <w:r>
+        <w:t xml:space="preserve"> are very scarce (for example, only two confirmed long-method cases). This means the reused data cannot independently validate the detectors as first hoped. Its role instead is a real-world cross-check for the reference-free measures later on. </w:t>
       </w:r>
     </w:p>
     <w:p>
@@ -5894,7 +7204,23 @@
     </w:p>
     <w:p>
       <w:r>
-        <w:t>One design choice is central. Pylint, Ruff and jscpd are deliberately NOT part of the panel. They created the labels, so scoring them against those same labels would be circular. They are the tools that define the smells; the panel is the set of independent measures we are actually evaluating. This is exactly the</w:t>
+        <w:t xml:space="preserve">One design choice is central. </w:t>
+      </w:r>
+      <w:proofErr w:type="spellStart"/>
+      <w:r>
+        <w:t>Pylint</w:t>
+      </w:r>
+      <w:proofErr w:type="spellEnd"/>
+      <w:r>
+        <w:t xml:space="preserve">, Ruff and </w:t>
+      </w:r>
+      <w:proofErr w:type="spellStart"/>
+      <w:r>
+        <w:t>jscpd</w:t>
+      </w:r>
+      <w:proofErr w:type="spellEnd"/>
+      <w:r>
+        <w:t xml:space="preserve"> are deliberately NOT part of the panel. They created the labels, so scoring them against those same labels would be circular. They are the tools that define the smells; the panel is the set of independent measures we are actually evaluating. This is exactly the</w:t>
       </w:r>
       <w:r>
         <w:t xml:space="preserve"> point mentioned earlier</w:t>
@@ -6017,9 +7343,11 @@
             <w:tcW w:w="3312" w:type="dxa"/>
           </w:tcPr>
           <w:p>
+            <w:proofErr w:type="spellStart"/>
             <w:r>
               <w:t>CodeBLEU</w:t>
             </w:r>
+            <w:proofErr w:type="spellEnd"/>
           </w:p>
         </w:tc>
         <w:tc>
@@ -6027,8 +7355,13 @@
             <w:tcW w:w="2592" w:type="dxa"/>
           </w:tcPr>
           <w:p>
-            <w:r>
-              <w:t>CodeBERTScore (needs a model)</w:t>
+            <w:proofErr w:type="spellStart"/>
+            <w:r>
+              <w:t>CodeBERTScore</w:t>
+            </w:r>
+            <w:proofErr w:type="spellEnd"/>
+            <w:r>
+              <w:t xml:space="preserve"> (needs a model)</w:t>
             </w:r>
           </w:p>
         </w:tc>
@@ -6055,7 +7388,15 @@
           </w:tcPr>
           <w:p>
             <w:r>
-              <w:t>BLEU, chrF, ROUGE-L</w:t>
+              <w:t xml:space="preserve">BLEU, </w:t>
+            </w:r>
+            <w:proofErr w:type="spellStart"/>
+            <w:r>
+              <w:t>chrF</w:t>
+            </w:r>
+            <w:proofErr w:type="spellEnd"/>
+            <w:r>
+              <w:t>, ROUGE-L</w:t>
             </w:r>
           </w:p>
         </w:tc>
@@ -6065,7 +7406,15 @@
           </w:tcPr>
           <w:p>
             <w:r>
-              <w:t>METEOR; BERTScore and perplexity (need a model)</w:t>
+              <w:t xml:space="preserve">METEOR; </w:t>
+            </w:r>
+            <w:proofErr w:type="spellStart"/>
+            <w:r>
+              <w:t>BERTScore</w:t>
+            </w:r>
+            <w:proofErr w:type="spellEnd"/>
+            <w:r>
+              <w:t xml:space="preserve"> and perplexity (need a model)</w:t>
             </w:r>
           </w:p>
         </w:tc>
@@ -6130,7 +7479,15 @@
         <w:ind w:hanging="288"/>
       </w:pPr>
       <w:r>
-        <w:t>•  The code-aware measure (CodeBLEU) separates several smells more cleanly than plain BLEU — early evidence that code-aware metrics beat naive text ones.</w:t>
+        <w:t>•  The code-aware measure (</w:t>
+      </w:r>
+      <w:proofErr w:type="spellStart"/>
+      <w:r>
+        <w:t>CodeBLEU</w:t>
+      </w:r>
+      <w:proofErr w:type="spellEnd"/>
+      <w:r>
+        <w:t>) separates several smells more cleanly than plain BLEU — early evidence that code-aware metrics beat naive text ones.</w:t>
       </w:r>
     </w:p>
     <w:p>
@@ -6152,7 +7509,23 @@
     </w:p>
     <w:p>
       <w:r>
-        <w:t>The work is split into two folders. The dataset scripts live in smell_injection/, and the evaluation tool lives in eval_tool/.</w:t>
+        <w:t xml:space="preserve">The work is split into two folders. The dataset scripts live in </w:t>
+      </w:r>
+      <w:proofErr w:type="spellStart"/>
+      <w:r>
+        <w:t>smell_injection</w:t>
+      </w:r>
+      <w:proofErr w:type="spellEnd"/>
+      <w:r>
+        <w:t xml:space="preserve">/, and the evaluation tool lives in </w:t>
+      </w:r>
+      <w:proofErr w:type="spellStart"/>
+      <w:r>
+        <w:t>eval_tool</w:t>
+      </w:r>
+      <w:proofErr w:type="spellEnd"/>
+      <w:r>
+        <w:t>/.</w:t>
       </w:r>
     </w:p>
     <w:tbl>
@@ -6231,9 +7604,19 @@
             <w:tcW w:w="3744" w:type="dxa"/>
           </w:tcPr>
           <w:p>
-            <w:r>
-              <w:t>smell_injection/samples.jsonl</w:t>
-            </w:r>
+            <w:proofErr w:type="spellStart"/>
+            <w:r>
+              <w:t>smell_injection</w:t>
+            </w:r>
+            <w:proofErr w:type="spellEnd"/>
+            <w:r>
+              <w:t>/</w:t>
+            </w:r>
+            <w:proofErr w:type="spellStart"/>
+            <w:r>
+              <w:t>samples.jsonl</w:t>
+            </w:r>
+            <w:proofErr w:type="spellEnd"/>
           </w:p>
         </w:tc>
         <w:tc>
@@ -6297,9 +7680,19 @@
             <w:tcW w:w="3744" w:type="dxa"/>
           </w:tcPr>
           <w:p>
-            <w:r>
-              <w:t>smell_injection/reused.jsonl</w:t>
-            </w:r>
+            <w:proofErr w:type="spellStart"/>
+            <w:r>
+              <w:t>smell_injection</w:t>
+            </w:r>
+            <w:proofErr w:type="spellEnd"/>
+            <w:r>
+              <w:t>/</w:t>
+            </w:r>
+            <w:proofErr w:type="spellStart"/>
+            <w:r>
+              <w:t>reused.jsonl</w:t>
+            </w:r>
+            <w:proofErr w:type="spellEnd"/>
           </w:p>
         </w:tc>
         <w:tc>
@@ -6385,8 +7778,13 @@
             <w:tcW w:w="3744" w:type="dxa"/>
           </w:tcPr>
           <w:p>
-            <w:r>
-              <w:t>eval_tool/panel_results.csv</w:t>
+            <w:proofErr w:type="spellStart"/>
+            <w:r>
+              <w:t>eval_tool</w:t>
+            </w:r>
+            <w:proofErr w:type="spellEnd"/>
+            <w:r>
+              <w:t>/panel_results.csv</w:t>
             </w:r>
           </w:p>
         </w:tc>
@@ -6407,8 +7805,13 @@
             <w:tcW w:w="3744" w:type="dxa"/>
           </w:tcPr>
           <w:p>
-            <w:r>
-              <w:t>eval_tool/panel_report.html</w:t>
+            <w:proofErr w:type="spellStart"/>
+            <w:r>
+              <w:t>eval_tool</w:t>
+            </w:r>
+            <w:proofErr w:type="spellEnd"/>
+            <w:r>
+              <w:t>/panel_report.html</w:t>
             </w:r>
           </w:p>
         </w:tc>
@@ -6455,16 +7858,50 @@
       </w:r>
     </w:p>
     <w:p>
+      <w:pPr>
+        <w:jc w:val="both"/>
+      </w:pPr>
       <w:r>
         <w:t>Each cell of the master table is a single number: the detection strength of one measure against one smell, computed from that smell's 100 clean/smelly pairs. For each pair, take the change the smell caused in the measure — the smelly value minus the clean value (Δ = smelly − clean). Average that change across the 100 pairs and divide it by the standard deviation of the change across the same pairs:</w:t>
       </w:r>
     </w:p>
     <w:p>
+      <w:pPr>
+        <w:jc w:val="center"/>
+      </w:pPr>
       <w:r>
         <w:rPr>
           <w:i/>
         </w:rPr>
-        <w:t>detection strength  =  mean(Δ)  ÷  standard deviation(Δ)</w:t>
+        <w:t xml:space="preserve">detection </w:t>
+      </w:r>
+      <w:proofErr w:type="gramStart"/>
+      <w:r>
+        <w:rPr>
+          <w:i/>
+        </w:rPr>
+        <w:t>strength  =</w:t>
+      </w:r>
+      <w:proofErr w:type="gramEnd"/>
+      <w:r>
+        <w:rPr>
+          <w:i/>
+        </w:rPr>
+        <w:t xml:space="preserve">  mean(</w:t>
+      </w:r>
+      <w:proofErr w:type="gramStart"/>
+      <w:r>
+        <w:rPr>
+          <w:i/>
+        </w:rPr>
+        <w:t>Δ)  ÷</w:t>
+      </w:r>
+      <w:proofErr w:type="gramEnd"/>
+      <w:r>
+        <w:rPr>
+          <w:i/>
+        </w:rPr>
+        <w:t xml:space="preserve">  standard deviation(Δ)</w:t>
       </w:r>
     </w:p>
     <w:p>
@@ -6473,8 +7910,12 @@
       </w:r>
     </w:p>
     <w:p>
-      <w:r>
-        <w:t>Intuitively it asks: when this smell is injected, how large and how consistent is the measure's reaction, relative to its own natural variation? Around 0 means no signal — the measure barely reacts, or reacts inconsistently, and is effectively blind to that smell. About 0.8 counts as a large effect, and above 2 is a very strong, almost every-time separation. Because the change is expressed in units of the measure's own variability, the score is comparable across measures whose raw scales are entirely different — lines of code against a 0–100 similarity score, say. Two edge cases are handled explicitly: a perfectly consistent shift with no spread would divide by zero, so it is set straight to the cap; and every value is capped at ±5 so that a few near-zero-variance cells cannot dominate the colour scale.</w:t>
+      <w:pPr>
+        <w:jc w:val="both"/>
+      </w:pPr>
+      <w:r>
+        <w:lastRenderedPageBreak/>
+        <w:t>Intuitively, this score asks: when this smell is injected, how large and how consistent is the measure's reaction, relative to its own natural variation? Around 0 means no signal — the measure barely reacts, or reacts inconsistently, and is effectively blind to that smell. About 0.8 counts as a large effect, and above 2 is a very strong, almost every-time separation. Because the change is expressed in units of the measure's own variability, the score is comparable across measures whose raw scales are entirely different — lines of code against a 0–100 similarity score, say. Two edge cases are handled explicitly: a perfectly consistent shift with no spread would divide by zero, so it is set straight to the cap; and every value is capped at ±5 so that a few near-zero-variance cells cannot dominate the colour scale.</w:t>
       </w:r>
     </w:p>
     <w:p/>
@@ -6537,6 +7978,126 @@
         <w:t xml:space="preserve"> generate on tasks the model hasn't seen (e.g., newer or private problem sets).</w:t>
       </w:r>
     </w:p>
+    <w:p>
+      <w:pPr>
+        <w:pStyle w:val="Heading2"/>
+      </w:pPr>
+      <w:r>
+        <w:t>Reading the model's smell distribution</w:t>
+      </w:r>
+    </w:p>
+    <w:p>
+      <w:pPr>
+        <w:jc w:val="both"/>
+      </w:pPr>
+      <w:r>
+        <w:t>The twelve smells were chosen, from the literature, as ones empirically common in LLM-generated code — that was one of the selection criteria. The benchmark holds a balanced hundred examples of each, both to validate the measures and because these are the smells we expect to matter for LLM output. The model evaluation is the complementary step: it points the validated tool at real generations and asks what the model actually writes.</w:t>
+      </w:r>
+    </w:p>
+    <w:p>
+      <w:pPr>
+        <w:jc w:val="both"/>
+      </w:pPr>
+      <w:r>
+        <w:t xml:space="preserve">On the Qwen generations only four of the twelve appear at all, dominated by magic numbers. This looks like it contradicts the selection criterion, but the two are at different scopes: the criterion describes LLM code in general, drawn from studies of realistic generation, whereas this evaluation uses a small model on MBPP and </w:t>
+      </w:r>
+      <w:proofErr w:type="spellStart"/>
+      <w:r>
+        <w:t>HumanEval</w:t>
+      </w:r>
+      <w:proofErr w:type="spellEnd"/>
+      <w:r>
+        <w:t xml:space="preserve"> — single short functions. Those tasks cannot physically exhibit the smells that only emerge at scale, such as a long method, deep nesting, or code duplicated across functions. Duplicate code is the clearest case: an across-unit smell that scoring one isolated function at a time can almost never reveal.</w:t>
+      </w:r>
+    </w:p>
+    <w:p>
+      <w:pPr>
+        <w:jc w:val="both"/>
+      </w:pPr>
+      <w:r>
+        <w:t xml:space="preserve">So, the </w:t>
+      </w:r>
+      <w:proofErr w:type="gramStart"/>
+      <w:r>
+        <w:t>near-absence</w:t>
+      </w:r>
+      <w:proofErr w:type="gramEnd"/>
+      <w:r>
+        <w:t xml:space="preserve"> is a limitation of the evaluation's scope, not evidence that the smells were poorly chosen or that the model writes clean code. If anything it sharpens the point: because these smells were selected precisely for being common in LLM output, a test that cannot surface them is under-powered for the phenomenon we set out to study. Observing the fuller distribution in practice would mean evaluating the model on larger, more realistic generation tasks rather than single short functions.</w:t>
+      </w:r>
+    </w:p>
+    <w:p>
+      <w:pPr>
+        <w:jc w:val="both"/>
+      </w:pPr>
+      <w:r>
+        <w:t>There is external support for this reading. Velasco</w:t>
+      </w:r>
+      <w:r>
+        <w:t>’s paper</w:t>
+      </w:r>
+      <w:r>
+        <w:t xml:space="preserve"> (</w:t>
+      </w:r>
+      <w:proofErr w:type="spellStart"/>
+      <w:r>
+        <w:t>CodeSmellEval</w:t>
+      </w:r>
+      <w:proofErr w:type="spellEnd"/>
+      <w:r>
+        <w:t>, 2025), from the same group as one of the datasets reused here, measured how prone two seven-billion-</w:t>
+      </w:r>
+      <w:r>
+        <w:lastRenderedPageBreak/>
+        <w:t xml:space="preserve">parameter models </w:t>
+      </w:r>
+      <w:r>
+        <w:t>(</w:t>
+      </w:r>
+      <w:proofErr w:type="spellStart"/>
+      <w:r>
+        <w:t>CodeLlama</w:t>
+      </w:r>
+      <w:proofErr w:type="spellEnd"/>
+      <w:r>
+        <w:t xml:space="preserve"> and Mistral</w:t>
+      </w:r>
+      <w:r>
+        <w:t xml:space="preserve">) </w:t>
+      </w:r>
+      <w:r>
+        <w:t xml:space="preserve">are to producing thirteen Pylint smells. Rather than generate code and inspect it, they fed the models existing smelly methods from GitHub and read off the probability each model assigned to the smelly tokens — a propensity score they call PSC, which captures a tendency to produce a smell rather than its appearance in generated output. Ten of the thirteen smells scored above their threshold, and the strongest included broad-exception-caught, too-many-nested-blocks, and too-many-boolean-expressions — our broad_except, deep_nesting, and complex_conditional, the very smells absent from the Qwen generations. </w:t>
+      </w:r>
+      <w:r>
+        <w:t>“Too</w:t>
+      </w:r>
+      <w:r>
+        <w:t>-many-arguments</w:t>
+      </w:r>
+      <w:r>
+        <w:t>” was a smell that was found to be rarely produced. Similarly,</w:t>
+      </w:r>
+      <w:r>
+        <w:t xml:space="preserve"> our </w:t>
+      </w:r>
+      <w:proofErr w:type="spellStart"/>
+      <w:r>
+        <w:t>long_parameter_list</w:t>
+      </w:r>
+      <w:proofErr w:type="spellEnd"/>
+      <w:r>
+        <w:t>, fell below their threshold and appeared just once in ours.</w:t>
+      </w:r>
+    </w:p>
+    <w:p>
+      <w:pPr>
+        <w:jc w:val="both"/>
+      </w:pPr>
+      <w:r>
+        <w:t>So the smells our short-function evaluation never surfaces are ones a probability-level probe shows the models are strongly inclined to produce. The difference is what each method measures: their score captures a latent tendency on code that already contains a smell, while our evaluation captures what actually appears when the model writes a full solution to a short task. The authors are explicit that these are different questions — they note that their score is computed from already-smelly code, and that “another study is needed to determine whether a correlation exists between PSC scores and the overall quality of the code generated by LLMs.” Measuring the quality of freely generated code is the question they leave open, and it is the one this evaluation answers.</w:t>
+      </w:r>
+    </w:p>
+    <w:p/>
     <w:sectPr>
       <w:pgSz w:w="11906" w:h="16838"/>
       <w:pgMar w:top="1440" w:right="1440" w:bottom="1440" w:left="1440" w:header="708" w:footer="708" w:gutter="0"/>

</xml_diff>

<commit_message>
Doc: make the paired->unpaired detection-strength change clear and defensible
Expand the derivation so the two forms are contrasted with formulas, the
paired form's failure is shown concretely (a constant one-line shift drives
the within-pair spread to zero, capping the score on a trivial change), an
intuition is given (consistency != detectability), and the two reasons the
unpaired form is right are stated (it measures distribution separation; and
real data has no pairs, so both sources sit on one comparable scale).
</commit_message>
<xml_diff>
--- a/docs/Code Smells Research Kai v4.docx
+++ b/docs/Code Smells Research Kai v4.docx
@@ -7930,7 +7930,27 @@
     </w:p>
     <w:p>
       <w:r>
-        <w:t>This is Cohen's d, a standard effect size, in its unpaired form. An earlier version used the paired form -- the average change within each clean/smelly pair divided by the spread of that change -- but it saturated whenever an injector added a constant shift: dead code and magic number each add one fixed line, driving the within-pair spread to zero and making a trivial change look like a perfect detector. Standardising by natural variation avoids this, and it is the same statistic used for the real-world data, so the injected and real scores sit on one comparable scale.</w:t>
+        <w:t>This is Cohen's d, the standard effect size, here in its unpaired form (the formula above). An earlier version of this project used the paired form of the same statistic, which asks a different question. Because every smelly example has a matched clean twin, the paired form works within each pair:</w:t>
+      </w:r>
+    </w:p>
+    <w:p>
+      <w:pPr>
+        <w:jc w:val="center"/>
+      </w:pPr>
+      <w:r>
+        <w:t>paired form  =  average of (smelly - clean) within each pair  /  how much that change varies from pair to pair</w:t>
+      </w:r>
+    </w:p>
+    <w:p>
+      <w:pPr/>
+      <w:r>
+        <w:t>The paired form breaks whenever an injector applies a constant shift. Dead code, for example, adds exactly one line to every function, so the change is +1 in every single pair; the variation in that change is then zero, and dividing by (near-)zero pushes the score to its cap. A trivial, uniform one-line change is reported as a flawless detector -- an artefact of how the smell was injected, not a real signal. The unpaired form does not have this problem: one line is negligible against the tens of lines by which real functions differ, so it scores near zero, correctly. Put simply: if everyone in a crowd stood on a one-centimetre block the change would be perfectly consistent, yet you still could not pick them out of the crowd -- being consistent is not the same as being detectable, and it is detectability we are trying to measure.</w:t>
+      </w:r>
+    </w:p>
+    <w:p>
+      <w:pPr/>
+      <w:r>
+        <w:t>Two things make the unpaired form the right choice rather than a workaround. First, it measures how far apart the clean and smelly distributions actually are, relative to how much code varies anyway -- which is exactly what “can this measure detect the smell” should mean. Second, the real-world data has no matched pairs (real smelly and clean functions are different pieces of code, not twins), so only the unpaired form can be computed there at all; using the same form for both puts the injected and the real detection strengths on one directly comparable scale.</w:t>
       </w:r>
     </w:p>
     <w:p>

</xml_diff>